<commit_message>
SVG preview with search, fix page breaks, blockquote spacing, cantSplit rows, header line, caption formatting
</commit_message>
<xml_diff>
--- a/projects/md-to-docx-showcase/output/document.docx
+++ b/projects/md-to-docx-showcase/output/document.docx
@@ -486,14 +486,10 @@
       </w:r>
     </w:p>
     <w:p>
-      <w:r>
-        <w:br w:type="page"/>
-      </w:r>
-    </w:p>
-    <w:p>
       <w:bookmarkStart w:id="6" w:name="h-document-structure"/>
       <w:pPr>
         <w:pStyle w:val="Heading1"/>
+        <w:pageBreakBefore w:val="1"/>
       </w:pPr>
       <w:r>
         <w:t>Document Structure</w:t>
@@ -611,14 +607,10 @@
       </w:r>
     </w:p>
     <w:p>
-      <w:r>
-        <w:br w:type="page"/>
-      </w:r>
-    </w:p>
-    <w:p>
       <w:bookmarkStart w:id="13" w:name="h-typography-and-text-formatting"/>
       <w:pPr>
         <w:pStyle w:val="Heading1"/>
+        <w:pageBreakBefore w:val="1"/>
       </w:pPr>
       <w:r>
         <w:t>Typography and Text Formatting</w:t>
@@ -744,10 +736,21 @@
     <w:p>
       <w:pPr>
         <w:pStyle w:val="BlockQuote"/>
+        <w:spacing w:after="0"/>
       </w:pPr>
       <w:r>
         <w:t>This is a standard blockquote. It can be used for important notes, citations, or highlighted information that stands out from the main text flow.</w:t>
       </w:r>
+    </w:p>
+    <w:p>
+      <w:pPr>
+        <w:spacing w:before="0" w:after="160" w:line="2" w:lineRule="exact"/>
+      </w:pPr>
+    </w:p>
+    <w:p>
+      <w:pPr>
+        <w:spacing w:before="0" w:after="160" w:line="2" w:lineRule="exact"/>
+      </w:pPr>
     </w:p>
     <w:p>
       <w:r>
@@ -755,14 +758,10 @@
       </w:r>
     </w:p>
     <w:p>
-      <w:r>
-        <w:br w:type="page"/>
-      </w:r>
-    </w:p>
-    <w:p>
       <w:bookmarkStart w:id="17" w:name="h-lists-and-enumeration"/>
       <w:pPr>
         <w:pStyle w:val="Heading1"/>
+        <w:pageBreakBefore w:val="1"/>
       </w:pPr>
       <w:r>
         <w:t>Lists and Enumeration</w:t>
@@ -1033,14 +1032,10 @@
       </w:r>
     </w:p>
     <w:p>
-      <w:r>
-        <w:br w:type="page"/>
-      </w:r>
-    </w:p>
-    <w:p>
       <w:bookmarkStart w:id="21" w:name="h-tables"/>
       <w:pPr>
         <w:pStyle w:val="Heading1"/>
+        <w:pageBreakBefore w:val="1"/>
       </w:pPr>
       <w:r>
         <w:t>Tables</w:t>
@@ -1075,6 +1070,9 @@
         <w:gridCol w:w="2340"/>
       </w:tblGrid>
       <w:tr>
+        <w:trPr>
+          <w:cantSplit w:val="1"/>
+        </w:trPr>
         <w:tc>
           <w:tcPr>
             <w:tcW w:type="dxa" w:w="2340"/>
@@ -1117,6 +1115,9 @@
         </w:tc>
       </w:tr>
       <w:tr>
+        <w:trPr>
+          <w:cantSplit w:val="1"/>
+        </w:trPr>
         <w:tc>
           <w:tcPr>
             <w:tcW w:type="dxa" w:w="2340"/>
@@ -1159,6 +1160,9 @@
         </w:tc>
       </w:tr>
       <w:tr>
+        <w:trPr>
+          <w:cantSplit w:val="1"/>
+        </w:trPr>
         <w:tc>
           <w:tcPr>
             <w:tcW w:type="dxa" w:w="2340"/>
@@ -1201,6 +1205,9 @@
         </w:tc>
       </w:tr>
       <w:tr>
+        <w:trPr>
+          <w:cantSplit w:val="1"/>
+        </w:trPr>
         <w:tc>
           <w:tcPr>
             <w:tcW w:type="dxa" w:w="2340"/>
@@ -1243,6 +1250,9 @@
         </w:tc>
       </w:tr>
       <w:tr>
+        <w:trPr>
+          <w:cantSplit w:val="1"/>
+        </w:trPr>
         <w:tc>
           <w:tcPr>
             <w:tcW w:type="dxa" w:w="2340"/>
@@ -1285,6 +1295,9 @@
         </w:tc>
       </w:tr>
       <w:tr>
+        <w:trPr>
+          <w:cantSplit w:val="1"/>
+        </w:trPr>
         <w:tc>
           <w:tcPr>
             <w:tcW w:type="dxa" w:w="2340"/>
@@ -1334,9 +1347,17 @@
         <w:jc w:val="center"/>
       </w:pPr>
       <w:r>
+        <w:rPr>
+          <w:b/>
+          <w:i/>
+        </w:rPr>
         <w:t>Table 1:</w:t>
       </w:r>
       <w:r>
+        <w:rPr>
+          <w:b w:val="0"/>
+          <w:i/>
+        </w:rPr>
         <w:t xml:space="preserve"> Feature implementation status and priorities.</w:t>
       </w:r>
       <w:bookmarkEnd w:id="23"/>
@@ -1387,6 +1408,9 @@
         <w:gridCol w:w="2340"/>
       </w:tblGrid>
       <w:tr>
+        <w:trPr>
+          <w:cantSplit w:val="1"/>
+        </w:trPr>
         <w:tc>
           <w:tcPr>
             <w:tcW w:type="dxa" w:w="2340"/>
@@ -1429,6 +1453,9 @@
         </w:tc>
       </w:tr>
       <w:tr>
+        <w:trPr>
+          <w:cantSplit w:val="1"/>
+        </w:trPr>
         <w:tc>
           <w:tcPr>
             <w:tcW w:type="dxa" w:w="2340"/>
@@ -1471,6 +1498,9 @@
         </w:tc>
       </w:tr>
       <w:tr>
+        <w:trPr>
+          <w:cantSplit w:val="1"/>
+        </w:trPr>
         <w:tc>
           <w:tcPr>
             <w:tcW w:type="dxa" w:w="2340"/>
@@ -1520,9 +1550,17 @@
         <w:jc w:val="center"/>
       </w:pPr>
       <w:r>
+        <w:rPr>
+          <w:b/>
+          <w:i/>
+        </w:rPr>
         <w:t>Table 3:</w:t>
       </w:r>
       <w:r>
+        <w:rPr>
+          <w:b w:val="0"/>
+          <w:i/>
+        </w:rPr>
         <w:t xml:space="preserve"> Data visualization example without headers.</w:t>
       </w:r>
       <w:bookmarkEnd w:id="25"/>
@@ -1555,6 +1593,9 @@
         <w:gridCol w:w="2340"/>
       </w:tblGrid>
       <w:tr>
+        <w:trPr>
+          <w:cantSplit w:val="1"/>
+        </w:trPr>
         <w:tc>
           <w:tcPr>
             <w:tcW w:type="dxa" w:w="2340"/>
@@ -1597,6 +1638,9 @@
         </w:tc>
       </w:tr>
       <w:tr>
+        <w:trPr>
+          <w:cantSplit w:val="1"/>
+        </w:trPr>
         <w:tc>
           <w:tcPr>
             <w:tcW w:type="dxa" w:w="2340"/>
@@ -1639,6 +1683,9 @@
         </w:tc>
       </w:tr>
       <w:tr>
+        <w:trPr>
+          <w:cantSplit w:val="1"/>
+        </w:trPr>
         <w:tc>
           <w:tcPr>
             <w:tcW w:type="dxa" w:w="2340"/>
@@ -1681,6 +1728,9 @@
         </w:tc>
       </w:tr>
       <w:tr>
+        <w:trPr>
+          <w:cantSplit w:val="1"/>
+        </w:trPr>
         <w:tc>
           <w:tcPr>
             <w:tcW w:type="dxa" w:w="2340"/>
@@ -1723,6 +1773,9 @@
         </w:tc>
       </w:tr>
       <w:tr>
+        <w:trPr>
+          <w:cantSplit w:val="1"/>
+        </w:trPr>
         <w:tc>
           <w:tcPr>
             <w:tcW w:type="dxa" w:w="2340"/>
@@ -1772,9 +1825,17 @@
         <w:jc w:val="center"/>
       </w:pPr>
       <w:r>
+        <w:rPr>
+          <w:b/>
+          <w:i/>
+        </w:rPr>
         <w:t>Table 2:</w:t>
       </w:r>
       <w:r>
+        <w:rPr>
+          <w:b w:val="0"/>
+          <w:i/>
+        </w:rPr>
         <w:t xml:space="preserve"> System architecture components with detailed descriptions.</w:t>
       </w:r>
       <w:bookmarkEnd w:id="27"/>
@@ -1834,6 +1895,9 @@
         <w:gridCol w:w="5616"/>
       </w:tblGrid>
       <w:tr>
+        <w:trPr>
+          <w:cantSplit w:val="1"/>
+        </w:trPr>
         <w:tc>
           <w:tcPr>
             <w:tcW w:w="1404" w:type="dxa"/>
@@ -1866,6 +1930,9 @@
         </w:tc>
       </w:tr>
       <w:tr>
+        <w:trPr>
+          <w:cantSplit w:val="1"/>
+        </w:trPr>
         <w:tc>
           <w:tcPr>
             <w:tcW w:w="1404" w:type="dxa"/>
@@ -1898,6 +1965,9 @@
         </w:tc>
       </w:tr>
       <w:tr>
+        <w:trPr>
+          <w:cantSplit w:val="1"/>
+        </w:trPr>
         <w:tc>
           <w:tcPr>
             <w:tcW w:w="1404" w:type="dxa"/>
@@ -1930,6 +2000,9 @@
         </w:tc>
       </w:tr>
       <w:tr>
+        <w:trPr>
+          <w:cantSplit w:val="1"/>
+        </w:trPr>
         <w:tc>
           <w:tcPr>
             <w:tcW w:w="1404" w:type="dxa"/>
@@ -1969,9 +2042,17 @@
         <w:jc w:val="center"/>
       </w:pPr>
       <w:r>
+        <w:rPr>
+          <w:b/>
+          <w:i/>
+        </w:rPr>
         <w:t>Table 3:</w:t>
       </w:r>
       <w:r>
+        <w:rPr>
+          <w:b w:val="0"/>
+          <w:i/>
+        </w:rPr>
         <w:t xml:space="preserve"> Example table with custom column width distribution.</w:t>
       </w:r>
       <w:bookmarkEnd w:id="29"/>
@@ -1982,14 +2063,10 @@
       </w:r>
     </w:p>
     <w:p>
-      <w:r>
-        <w:br w:type="page"/>
-      </w:r>
-    </w:p>
-    <w:p>
       <w:bookmarkStart w:id="30" w:name="h-images-and-figures"/>
       <w:pPr>
         <w:pStyle w:val="Heading1"/>
+        <w:pageBreakBefore w:val="1"/>
       </w:pPr>
       <w:r>
         <w:t>Images and Figures</w:t>
@@ -2068,9 +2145,17 @@
         <w:jc w:val="center"/>
       </w:pPr>
       <w:r>
+        <w:rPr>
+          <w:b/>
+          <w:i/>
+        </w:rPr>
         <w:t>Figure 1:</w:t>
       </w:r>
       <w:r>
+        <w:rPr>
+          <w:b w:val="0"/>
+          <w:i/>
+        </w:rPr>
         <w:t xml:space="preserve"> Complete system overview diagram showing all major components and their relationships.</w:t>
       </w:r>
       <w:bookmarkEnd w:id="33"/>
@@ -2155,9 +2240,17 @@
         <w:jc w:val="left"/>
       </w:pPr>
       <w:r>
+        <w:rPr>
+          <w:b/>
+          <w:i/>
+        </w:rPr>
         <w:t>Figure 1:</w:t>
       </w:r>
       <w:r>
+        <w:rPr>
+          <w:b w:val="0"/>
+          <w:i/>
+        </w:rPr>
         <w:t xml:space="preserve"> Individual module icon representing the parsing engine.</w:t>
       </w:r>
       <w:bookmarkEnd w:id="35"/>
@@ -2229,9 +2322,17 @@
         <w:jc w:val="center"/>
       </w:pPr>
       <w:r>
+        <w:rPr>
+          <w:b/>
+          <w:i/>
+        </w:rPr>
         <w:t>Figure 2:</w:t>
       </w:r>
       <w:r>
+        <w:rPr>
+          <w:b w:val="0"/>
+          <w:i/>
+        </w:rPr>
         <w:t xml:space="preserve"> Data flow diagram showing information pathways through the system.</w:t>
       </w:r>
       <w:bookmarkEnd w:id="37"/>
@@ -2484,9 +2585,17 @@
         <w:jc w:val="center"/>
       </w:pPr>
       <w:r>
+        <w:rPr>
+          <w:b/>
+          <w:i/>
+        </w:rPr>
         <w:t>Figure 3:</w:t>
       </w:r>
       <w:r>
+        <w:rPr>
+          <w:b w:val="0"/>
+          <w:i/>
+        </w:rPr>
         <w:t xml:space="preserve"> Three-phase processing pipeline: input parsing, document building, and quality validation.</w:t>
       </w:r>
       <w:bookmarkEnd w:id="39"/>
@@ -2510,14 +2619,10 @@
       </w:r>
     </w:p>
     <w:p>
-      <w:r>
-        <w:br w:type="page"/>
-      </w:r>
-    </w:p>
-    <w:p>
       <w:bookmarkStart w:id="40" w:name="h-cross-references-and-linking"/>
       <w:pPr>
         <w:pStyle w:val="Heading1"/>
+        <w:pageBreakBefore w:val="1"/>
       </w:pPr>
       <w:r>
         <w:t>Cross-References and Linking</w:t>
@@ -2599,14 +2704,10 @@
       </w:r>
     </w:p>
     <w:p>
-      <w:r>
-        <w:br w:type="page"/>
-      </w:r>
-    </w:p>
-    <w:p>
       <w:bookmarkStart w:id="43" w:name="h-code-examples"/>
       <w:pPr>
         <w:pStyle w:val="Heading1"/>
+        <w:pageBreakBefore w:val="1"/>
       </w:pPr>
       <w:r>
         <w:t>Code Examples</w:t>
@@ -2746,14 +2847,10 @@
       </w:r>
     </w:p>
     <w:p>
-      <w:r>
-        <w:br w:type="page"/>
-      </w:r>
-    </w:p>
-    <w:p>
       <w:bookmarkStart w:id="46" w:name="h-special-elements"/>
       <w:pPr>
         <w:pStyle w:val="Heading1"/>
+        <w:pageBreakBefore w:val="1"/>
       </w:pPr>
       <w:r>
         <w:t>Special Elements</w:t>
@@ -2823,7 +2920,12 @@
     </w:tbl>
     <w:p>
       <w:pPr>
-        <w:spacing w:before="0" w:after="0"/>
+        <w:spacing w:before="0" w:after="160"/>
+      </w:pPr>
+    </w:p>
+    <w:p>
+      <w:pPr>
+        <w:spacing w:before="0" w:after="160" w:line="2" w:lineRule="exact"/>
       </w:pPr>
     </w:p>
     <w:tbl>
@@ -2874,7 +2976,12 @@
     </w:tbl>
     <w:p>
       <w:pPr>
-        <w:spacing w:before="0" w:after="0"/>
+        <w:spacing w:before="0" w:after="160"/>
+      </w:pPr>
+    </w:p>
+    <w:p>
+      <w:pPr>
+        <w:spacing w:before="0" w:after="160" w:line="2" w:lineRule="exact"/>
       </w:pPr>
     </w:p>
     <w:tbl>
@@ -2925,7 +3032,12 @@
     </w:tbl>
     <w:p>
       <w:pPr>
-        <w:spacing w:before="0" w:after="0"/>
+        <w:spacing w:before="0" w:after="160"/>
+      </w:pPr>
+    </w:p>
+    <w:p>
+      <w:pPr>
+        <w:spacing w:before="0" w:after="160" w:line="2" w:lineRule="exact"/>
       </w:pPr>
     </w:p>
     <w:tbl>
@@ -2976,7 +3088,12 @@
     </w:tbl>
     <w:p>
       <w:pPr>
-        <w:spacing w:before="0" w:after="0"/>
+        <w:spacing w:before="0" w:after="160"/>
+      </w:pPr>
+    </w:p>
+    <w:p>
+      <w:pPr>
+        <w:spacing w:before="0" w:after="160" w:line="2" w:lineRule="exact"/>
       </w:pPr>
     </w:p>
     <w:p>
@@ -2995,24 +3112,18 @@
       </w:r>
     </w:p>
     <w:p>
-      <w:r>
-        <w:br w:type="page"/>
-      </w:r>
-    </w:p>
-    <w:p>
+      <w:pPr>
+        <w:pageBreakBefore w:val="1"/>
+      </w:pPr>
       <w:r>
         <w:t>They create a clear break without starting a new page.</w:t>
       </w:r>
     </w:p>
     <w:p>
-      <w:r>
-        <w:br w:type="page"/>
-      </w:r>
-    </w:p>
-    <w:p>
       <w:bookmarkStart w:id="49" w:name="h-vertical-space"/>
       <w:pPr>
         <w:pStyle w:val="Heading2"/>
+        <w:pageBreakBefore w:val="1"/>
       </w:pPr>
       <w:r>
         <w:t>Vertical Space</w:t>
@@ -3080,11 +3191,6 @@
       </w:r>
     </w:p>
     <w:p>
-      <w:r>
-        <w:br w:type="page"/>
-      </w:r>
-    </w:p>
-    <w:p>
       <w:bookmarkStart w:id="50" w:name="h-appendix"/>
       <w:pPr>
         <w:numPr>
@@ -3092,6 +3198,7 @@
           <w:numId w:val="0"/>
         </w:numPr>
         <w:pStyle w:val="Heading1"/>
+        <w:pageBreakBefore w:val="1"/>
       </w:pPr>
       <w:r>
         <w:t>Appendix</w:t>
@@ -3206,6 +3313,9 @@
         <w:gridCol w:w="3120"/>
       </w:tblGrid>
       <w:tr>
+        <w:trPr>
+          <w:cantSplit w:val="1"/>
+        </w:trPr>
         <w:tc>
           <w:tcPr>
             <w:tcW w:type="dxa" w:w="3120"/>
@@ -3238,6 +3348,9 @@
         </w:tc>
       </w:tr>
       <w:tr>
+        <w:trPr>
+          <w:cantSplit w:val="1"/>
+        </w:trPr>
         <w:tc>
           <w:tcPr>
             <w:tcW w:type="dxa" w:w="3120"/>
@@ -3270,6 +3383,9 @@
         </w:tc>
       </w:tr>
       <w:tr>
+        <w:trPr>
+          <w:cantSplit w:val="1"/>
+        </w:trPr>
         <w:tc>
           <w:tcPr>
             <w:tcW w:type="dxa" w:w="3120"/>
@@ -4023,11 +4139,9 @@
       </w:r>
     </w:p>
     <w:p>
-      <w:r>
-        <w:br w:type="page"/>
-      </w:r>
-    </w:p>
-    <w:p>
+      <w:pPr>
+        <w:pageBreakBefore w:val="1"/>
+      </w:pPr>
       <w:r>
         <w:rPr>
           <w:b w:val="0"/>
@@ -4163,9 +4277,6 @@
               <w:tab w:val="right" w:pos="8245"/>
             </w:tabs>
             <w:spacing w:before="0" w:after="0"/>
-            <w:pBdr>
-              <w:bottom w:val="single" w:sz="6" w:space="4" w:color="AAAAAA"/>
-            </w:pBdr>
           </w:pPr>
           <w:r>
             <w:t>Your Name</w:t>
@@ -4228,6 +4339,14 @@
       </w:tc>
     </w:tr>
   </w:tbl>
+  <w:p>
+    <w:pPr>
+      <w:spacing w:before="0" w:after="0"/>
+      <w:pBdr>
+        <w:top w:val="single" w:sz="6" w:space="4" w:color="AAAAAA"/>
+      </w:pBdr>
+    </w:pPr>
+  </w:p>
 </w:hdr>
 </file>
 

</xml_diff>

<commit_message>
Add gitignore, move preview files to render folder, fix double render, Protected View bypass
</commit_message>
<xml_diff>
--- a/projects/md-to-docx-showcase/output/document.docx
+++ b/projects/md-to-docx-showcase/output/document.docx
@@ -512,12 +512,12 @@
       </w:r>
     </w:p>
     <w:p>
-      <w:bookmarkStart w:id="8" w:name="h-level-3-test2"/>
+      <w:bookmarkStart w:id="8" w:name="h-level-3-heading"/>
       <w:pPr>
         <w:pStyle w:val="Heading3"/>
       </w:pPr>
       <w:r>
-        <w:t>Level 3 Test2</w:t>
+        <w:t>Level 3 Heading</w:t>
       </w:r>
       <w:bookmarkEnd w:id="8"/>
     </w:p>
@@ -618,12 +618,12 @@
       <w:bookmarkEnd w:id="13"/>
     </w:p>
     <w:p>
-      <w:bookmarkStart w:id="14" w:name="h-basic-text-styles-tatia"/>
+      <w:bookmarkStart w:id="14" w:name="h-basic-text-styles"/>
       <w:pPr>
         <w:pStyle w:val="Heading2"/>
       </w:pPr>
       <w:r>
-        <w:t>Basic Text Styles Tatia</w:t>
+        <w:t>Basic Text Styles</w:t>
       </w:r>
       <w:bookmarkEnd w:id="14"/>
     </w:p>
@@ -638,14 +638,16 @@
           <w:b w:val="0"/>
           <w:i/>
         </w:rPr>
-        <w:t>Italic text is used for emphasis or citations.</w:t>
+        <w:t>Italic text</w:t>
+      </w:r>
+      <w:r>
+        <w:t xml:space="preserve"> is used for emphasis or citations.</w:t>
       </w:r>
     </w:p>
     <w:p>
       <w:r>
         <w:rPr>
           <w:b/>
-          <w:i/>
         </w:rPr>
         <w:t>Bold text</w:t>
       </w:r>
@@ -1349,7 +1351,7 @@
           <w:b/>
           <w:i/>
         </w:rPr>
-        <w:t>Table 4:</w:t>
+        <w:t>Table 1:</w:t>
       </w:r>
       <w:r>
         <w:rPr>
@@ -1371,7 +1373,7 @@
             <w:color w:val="0563C1"/>
             <w:u w:val="single"/>
           </w:rPr>
-          <w:t xml:space="preserve">Table 4</w:t>
+          <w:t xml:space="preserve">Table 1</w:t>
         </w:r>
       </w:hyperlink>
       <w:r>
@@ -1827,7 +1829,7 @@
           <w:b/>
           <w:i/>
         </w:rPr>
-        <w:t>Table 5:</w:t>
+        <w:t>Table 2:</w:t>
       </w:r>
       <w:r>
         <w:rPr>
@@ -1849,7 +1851,7 @@
             <w:color w:val="0563C1"/>
             <w:u w:val="single"/>
           </w:rPr>
-          <w:t xml:space="preserve">Table 5</w:t>
+          <w:t xml:space="preserve">Table 2</w:t>
         </w:r>
       </w:hyperlink>
       <w:r>
@@ -2044,7 +2046,7 @@
           <w:b/>
           <w:i/>
         </w:rPr>
-        <w:t>Table 6:</w:t>
+        <w:t>Table 3:</w:t>
       </w:r>
       <w:r>
         <w:rPr>
@@ -2147,7 +2149,7 @@
           <w:b/>
           <w:i/>
         </w:rPr>
-        <w:t>Figure 4:</w:t>
+        <w:t>Figure 1:</w:t>
       </w:r>
       <w:r>
         <w:rPr>
@@ -2169,7 +2171,7 @@
             <w:color w:val="0563C1"/>
             <w:u w:val="single"/>
           </w:rPr>
-          <w:t xml:space="preserve">Figure 4</w:t>
+          <w:t xml:space="preserve">Figure 1</w:t>
         </w:r>
       </w:hyperlink>
       <w:r>
@@ -2324,7 +2326,7 @@
           <w:b/>
           <w:i/>
         </w:rPr>
-        <w:t>Figure 5:</w:t>
+        <w:t>Figure 2:</w:t>
       </w:r>
       <w:r>
         <w:rPr>
@@ -2587,7 +2589,7 @@
           <w:b/>
           <w:i/>
         </w:rPr>
-        <w:t>Figure 6:</w:t>
+        <w:t>Figure 3:</w:t>
       </w:r>
       <w:r>
         <w:rPr>
@@ -2609,7 +2611,7 @@
             <w:color w:val="0563C1"/>
             <w:u w:val="single"/>
           </w:rPr>
-          <w:t xml:space="preserve">Figure 6</w:t>
+          <w:t xml:space="preserve">Figure 3</w:t>
         </w:r>
       </w:hyperlink>
       <w:r>
@@ -4118,3809 +4120,6 @@
         <w:numPr>
           <w:ilvl w:val="0"/>
           <w:numId w:val="20"/>
-        </w:numPr>
-        <w:pStyle w:val="ListBullet"/>
-      </w:pPr>
-      <w:r>
-        <w:rPr>
-          <w:b/>
-        </w:rPr>
-        <w:t>Code language support</w:t>
-      </w:r>
-      <w:r>
-        <w:t>: Python, JavaScript, and any code</w:t>
-      </w:r>
-    </w:p>
-    <w:p>
-      <w:r>
-        <w:t>These values demonstrate how properties from YAML files are dynamically inserted into the document content at conversion time.</w:t>
-      </w:r>
-    </w:p>
-    <w:p>
-      <w:pPr>
-        <w:pageBreakBefore w:val="1"/>
-      </w:pPr>
-      <w:r>
-        <w:rPr>
-          <w:b w:val="0"/>
-          <w:i/>
-        </w:rPr>
-        <w:t>End of Document</w:t>
-      </w:r>
-    </w:p>
-    <w:p>
-      <w:bookmarkStart w:id="62" w:name="h-introduction"/>
-      <w:pPr>
-        <w:pStyle w:val="Heading1"/>
-      </w:pPr>
-      <w:r>
-        <w:t>Introduction</w:t>
-      </w:r>
-      <w:bookmarkEnd w:id="62"/>
-    </w:p>
-    <w:p>
-      <w:r>
-        <w:t>This document serves as a comprehensive demonstration of the md_to_docx converter capabilities. It showcases the various formatting features and document elements that can be automatically converted from Markdown syntax to professional Microsoft Word documents.</w:t>
-      </w:r>
-    </w:p>
-    <w:p>
-      <w:bookmarkStart w:id="63" w:name="h-purpose-and-scope"/>
-      <w:pPr>
-        <w:pStyle w:val="Heading2"/>
-      </w:pPr>
-      <w:r>
-        <w:t>Purpose and Scope</w:t>
-      </w:r>
-      <w:bookmarkEnd w:id="63"/>
-    </w:p>
-    <w:p>
-      <w:r>
-        <w:t>The primary objectives of this showcase are to:</w:t>
-      </w:r>
-    </w:p>
-    <w:p>
-      <w:pPr>
-        <w:numPr>
-          <w:ilvl w:val="0"/>
-          <w:numId w:val="21"/>
-        </w:numPr>
-        <w:pStyle w:val="ListNumber"/>
-      </w:pPr>
-      <w:r>
-        <w:rPr>
-          <w:b/>
-        </w:rPr>
-        <w:t>Demonstrate document structure capabilities</w:t>
-      </w:r>
-      <w:r>
-        <w:t xml:space="preserve"> including multi-level headings, automatic table of contents generation, and section organization</w:t>
-      </w:r>
-    </w:p>
-    <w:p>
-      <w:pPr>
-        <w:numPr>
-          <w:ilvl w:val="0"/>
-          <w:numId w:val="21"/>
-        </w:numPr>
-        <w:pStyle w:val="ListNumber"/>
-      </w:pPr>
-      <w:r>
-        <w:rPr>
-          <w:b/>
-        </w:rPr>
-        <w:t>Present text formatting features</w:t>
-      </w:r>
-      <w:r>
-        <w:t xml:space="preserve"> such as emphasis, inline code, and paragraph styling</w:t>
-      </w:r>
-    </w:p>
-    <w:p>
-      <w:pPr>
-        <w:numPr>
-          <w:ilvl w:val="0"/>
-          <w:numId w:val="21"/>
-        </w:numPr>
-        <w:pStyle w:val="ListNumber"/>
-      </w:pPr>
-      <w:r>
-        <w:rPr>
-          <w:b/>
-        </w:rPr>
-        <w:t>Illustrate list functionality</w:t>
-      </w:r>
-      <w:r>
-        <w:t xml:space="preserve"> including ordered, unordered, and nested list structures</w:t>
-      </w:r>
-    </w:p>
-    <w:p>
-      <w:pPr>
-        <w:numPr>
-          <w:ilvl w:val="0"/>
-          <w:numId w:val="21"/>
-        </w:numPr>
-        <w:pStyle w:val="ListNumber"/>
-      </w:pPr>
-      <w:r>
-        <w:rPr>
-          <w:b/>
-        </w:rPr>
-        <w:t>Exhibit table generation</w:t>
-      </w:r>
-      <w:r>
-        <w:t xml:space="preserve"> with various formatting options and column width controls</w:t>
-      </w:r>
-    </w:p>
-    <w:p>
-      <w:pPr>
-        <w:numPr>
-          <w:ilvl w:val="0"/>
-          <w:numId w:val="21"/>
-        </w:numPr>
-        <w:pStyle w:val="ListNumber"/>
-      </w:pPr>
-      <w:r>
-        <w:rPr>
-          <w:b/>
-        </w:rPr>
-        <w:t>Showcase image handling</w:t>
-      </w:r>
-      <w:r>
-        <w:t xml:space="preserve"> including standalone images, figure groups, and size controls</w:t>
-      </w:r>
-    </w:p>
-    <w:p>
-      <w:pPr>
-        <w:numPr>
-          <w:ilvl w:val="0"/>
-          <w:numId w:val="21"/>
-        </w:numPr>
-        <w:pStyle w:val="ListNumber"/>
-      </w:pPr>
-      <w:r>
-        <w:rPr>
-          <w:b/>
-        </w:rPr>
-        <w:t>Highlight cross-referencing</w:t>
-      </w:r>
-      <w:r>
-        <w:t xml:space="preserve"> capabilities for figures, tables, and sections</w:t>
-      </w:r>
-    </w:p>
-    <w:p>
-      <w:bookmarkStart w:id="64" w:name="h-document-structure"/>
-      <w:pPr>
-        <w:pStyle w:val="Heading1"/>
-        <w:pageBreakBefore w:val="1"/>
-      </w:pPr>
-      <w:r>
-        <w:t>Document Structure</w:t>
-      </w:r>
-      <w:bookmarkEnd w:id="64"/>
-    </w:p>
-    <w:p>
-      <w:bookmarkStart w:id="65" w:name="h-heading-hierarchy"/>
-      <w:pPr>
-        <w:pStyle w:val="Heading2"/>
-      </w:pPr>
-      <w:r>
-        <w:t>Heading Hierarchy</w:t>
-      </w:r>
-      <w:bookmarkEnd w:id="65"/>
-    </w:p>
-    <w:p>
-      <w:r>
-        <w:t>The converter supports six levels of headings, automatically numbered and styled with a professional color scheme:</w:t>
-      </w:r>
-    </w:p>
-    <w:p>
-      <w:bookmarkStart w:id="66" w:name="h-level-3-heading"/>
-      <w:pPr>
-        <w:pStyle w:val="Heading3"/>
-      </w:pPr>
-      <w:r>
-        <w:t>Level 3 Heading</w:t>
-      </w:r>
-      <w:bookmarkEnd w:id="66"/>
-    </w:p>
-    <w:p>
-      <w:r>
-        <w:t>This demonstrates the third level of the document hierarchy.</w:t>
-      </w:r>
-    </w:p>
-    <w:p>
-      <w:bookmarkStart w:id="67" w:name="h-level-4-heading"/>
-      <w:pPr>
-        <w:pStyle w:val="Heading4"/>
-      </w:pPr>
-      <w:r>
-        <w:t>Level 4 Heading</w:t>
-      </w:r>
-      <w:bookmarkEnd w:id="67"/>
-    </w:p>
-    <w:p>
-      <w:r>
-        <w:t>Fourth level headings provide additional granularity for complex documents.</w:t>
-      </w:r>
-    </w:p>
-    <w:p>
-      <w:bookmarkStart w:id="68" w:name="h-level-5-heading"/>
-      <w:pPr>
-        <w:pStyle w:val="Heading5"/>
-      </w:pPr>
-      <w:r>
-        <w:t>Level 5 Heading</w:t>
-      </w:r>
-      <w:bookmarkEnd w:id="68"/>
-    </w:p>
-    <w:p>
-      <w:r>
-        <w:t>Fifth level headings for detailed subsections.</w:t>
-      </w:r>
-    </w:p>
-    <w:p>
-      <w:bookmarkStart w:id="69" w:name="h-level-6-heading"/>
-      <w:pPr>
-        <w:pStyle w:val="Heading6"/>
-      </w:pPr>
-      <w:r>
-        <w:t>Level 6 Heading</w:t>
-      </w:r>
-      <w:bookmarkEnd w:id="69"/>
-    </w:p>
-    <w:p>
-      <w:r>
-        <w:t>The deepest level of heading hierarchy available.</w:t>
-      </w:r>
-    </w:p>
-    <w:p>
-      <w:bookmarkStart w:id="70" w:name="h-heading-customization"/>
-      <w:pPr>
-        <w:pStyle w:val="Heading2"/>
-      </w:pPr>
-      <w:r>
-        <w:t>Heading Customization</w:t>
-      </w:r>
-      <w:bookmarkEnd w:id="70"/>
-    </w:p>
-    <w:p>
-      <w:r>
-        <w:t xml:space="preserve">Headings can be excluded from the table of contents using the </w:t>
-      </w:r>
-      <w:r>
-        <w:rPr>
-          <w:rFonts w:ascii="Courier New" w:hAnsi="Courier New"/>
-          <w:sz w:val="20"/>
-        </w:rPr>
-        <w:t>{.notoc}</w:t>
-      </w:r>
-      <w:r>
-        <w:t xml:space="preserve"> attribute, or numbering can be suppressed with </w:t>
-      </w:r>
-      <w:r>
-        <w:rPr>
-          <w:rFonts w:ascii="Courier New" w:hAnsi="Courier New"/>
-          <w:sz w:val="20"/>
-        </w:rPr>
-        <w:t>{.nonumber}</w:t>
-      </w:r>
-      <w:r>
-        <w:t>.</w:t>
-      </w:r>
-    </w:p>
-    <w:p>
-      <w:bookmarkStart w:id="71" w:name="h-typography-and-text-formatting"/>
-      <w:pPr>
-        <w:pStyle w:val="Heading1"/>
-        <w:pageBreakBefore w:val="1"/>
-      </w:pPr>
-      <w:r>
-        <w:t>Typography and Text Formatting</w:t>
-      </w:r>
-      <w:bookmarkEnd w:id="71"/>
-    </w:p>
-    <w:p>
-      <w:bookmarkStart w:id="72" w:name="h-basic-text-styles"/>
-      <w:pPr>
-        <w:pStyle w:val="Heading2"/>
-      </w:pPr>
-      <w:r>
-        <w:t>Basic Text Styles</w:t>
-      </w:r>
-      <w:bookmarkEnd w:id="72"/>
-    </w:p>
-    <w:p>
-      <w:r>
-        <w:t>The converter supports standard Markdown text formatting:</w:t>
-      </w:r>
-    </w:p>
-    <w:p>
-      <w:r>
-        <w:rPr>
-          <w:b w:val="0"/>
-          <w:i/>
-        </w:rPr>
-        <w:t>Italic text</w:t>
-      </w:r>
-      <w:r>
-        <w:t xml:space="preserve"> is used for emphasis or citations.</w:t>
-      </w:r>
-    </w:p>
-    <w:p>
-      <w:r>
-        <w:rPr>
-          <w:b/>
-        </w:rPr>
-        <w:t>Bold text</w:t>
-      </w:r>
-      <w:r>
-        <w:t xml:space="preserve"> draws attention to important information.</w:t>
-      </w:r>
-    </w:p>
-    <w:p>
-      <w:r>
-        <w:rPr>
-          <w:b/>
-          <w:i/>
-        </w:rPr>
-        <w:t>Bold and italic combined</w:t>
-      </w:r>
-      <w:r>
-        <w:t xml:space="preserve"> creates strong emphasis.</w:t>
-      </w:r>
-    </w:p>
-    <w:p>
-      <w:r>
-        <w:rPr>
-          <w:strike/>
-        </w:rPr>
-        <w:t>Strikethrough</w:t>
-      </w:r>
-      <w:r>
-        <w:t xml:space="preserve"> indicates removed or deprecated content.</w:t>
-      </w:r>
-    </w:p>
-    <w:p>
-      <w:bookmarkStart w:id="73" w:name="h-inline-code"/>
-      <w:pPr>
-        <w:pStyle w:val="Heading2"/>
-      </w:pPr>
-      <w:r>
-        <w:t>Inline Code</w:t>
-      </w:r>
-      <w:bookmarkEnd w:id="73"/>
-    </w:p>
-    <w:p>
-      <w:r>
-        <w:t xml:space="preserve">Technical terms and code snippets can be displayed inline using backticks: </w:t>
-      </w:r>
-      <w:r>
-        <w:rPr>
-          <w:rFonts w:ascii="Courier New" w:hAnsi="Courier New"/>
-          <w:sz w:val="20"/>
-        </w:rPr>
-        <w:t>function_name()</w:t>
-      </w:r>
-      <w:r>
-        <w:t xml:space="preserve">, </w:t>
-      </w:r>
-      <w:r>
-        <w:rPr>
-          <w:rFonts w:ascii="Courier New" w:hAnsi="Courier New"/>
-          <w:sz w:val="20"/>
-        </w:rPr>
-        <w:t>variable_value</w:t>
-      </w:r>
-      <w:r>
-        <w:t xml:space="preserve">, or </w:t>
-      </w:r>
-      <w:r>
-        <w:rPr>
-          <w:rFonts w:ascii="Courier New" w:hAnsi="Courier New"/>
-          <w:sz w:val="20"/>
-        </w:rPr>
-        <w:t>CSS_property</w:t>
-      </w:r>
-      <w:r>
-        <w:t>.</w:t>
-      </w:r>
-    </w:p>
-    <w:p>
-      <w:bookmarkStart w:id="74" w:name="h-blockquotes"/>
-      <w:pPr>
-        <w:pStyle w:val="Heading2"/>
-      </w:pPr>
-      <w:r>
-        <w:t>Blockquotes</w:t>
-      </w:r>
-      <w:bookmarkEnd w:id="74"/>
-    </w:p>
-    <w:p>
-      <w:pPr>
-        <w:pStyle w:val="BlockQuote"/>
-        <w:spacing w:after="0"/>
-      </w:pPr>
-      <w:r>
-        <w:t>This is a standard blockquote. It can be used for important notes, citations, or highlighted information that stands out from the main text flow.</w:t>
-      </w:r>
-    </w:p>
-    <w:p>
-      <w:pPr>
-        <w:spacing w:before="0" w:after="160" w:line="2" w:lineRule="exact"/>
-      </w:pPr>
-    </w:p>
-    <w:p>
-      <w:pPr>
-        <w:spacing w:before="0" w:after="160" w:line="2" w:lineRule="exact"/>
-      </w:pPr>
-    </w:p>
-    <w:p>
-      <w:r>
-        <w:t>Blockquotes feature a distinctive left border and italicized text for visual differentiation.</w:t>
-      </w:r>
-    </w:p>
-    <w:p>
-      <w:bookmarkStart w:id="75" w:name="h-lists-and-enumeration"/>
-      <w:pPr>
-        <w:pStyle w:val="Heading1"/>
-        <w:pageBreakBefore w:val="1"/>
-      </w:pPr>
-      <w:r>
-        <w:t>Lists and Enumeration</w:t>
-      </w:r>
-      <w:bookmarkEnd w:id="75"/>
-    </w:p>
-    <w:p>
-      <w:bookmarkStart w:id="76" w:name="h-unordered-lists"/>
-      <w:pPr>
-        <w:pStyle w:val="Heading2"/>
-      </w:pPr>
-      <w:r>
-        <w:t>Unordered Lists</w:t>
-      </w:r>
-      <w:bookmarkEnd w:id="76"/>
-    </w:p>
-    <w:p>
-      <w:r>
-        <w:t>Simple bullet points for itemized information:</w:t>
-      </w:r>
-    </w:p>
-    <w:p>
-      <w:pPr>
-        <w:numPr>
-          <w:ilvl w:val="0"/>
-          <w:numId w:val="22"/>
-        </w:numPr>
-        <w:pStyle w:val="ListBullet"/>
-      </w:pPr>
-      <w:r>
-        <w:t>First item in the list</w:t>
-      </w:r>
-    </w:p>
-    <w:p>
-      <w:pPr>
-        <w:numPr>
-          <w:ilvl w:val="0"/>
-          <w:numId w:val="22"/>
-        </w:numPr>
-        <w:pStyle w:val="ListBullet"/>
-      </w:pPr>
-      <w:r>
-        <w:t>Second item with additional context</w:t>
-      </w:r>
-    </w:p>
-    <w:p>
-      <w:pPr>
-        <w:numPr>
-          <w:ilvl w:val="0"/>
-          <w:numId w:val="22"/>
-        </w:numPr>
-        <w:pStyle w:val="ListBullet"/>
-      </w:pPr>
-      <w:r>
-        <w:t>Third item demonstrating the format</w:t>
-      </w:r>
-    </w:p>
-    <w:p>
-      <w:bookmarkStart w:id="77" w:name="h-ordered-lists"/>
-      <w:pPr>
-        <w:pStyle w:val="Heading2"/>
-      </w:pPr>
-      <w:r>
-        <w:t>Ordered Lists</w:t>
-      </w:r>
-      <w:bookmarkEnd w:id="77"/>
-    </w:p>
-    <w:p>
-      <w:r>
-        <w:t>Numbered sequences for procedural documentation:</w:t>
-      </w:r>
-    </w:p>
-    <w:p>
-      <w:pPr>
-        <w:numPr>
-          <w:ilvl w:val="0"/>
-          <w:numId w:val="23"/>
-        </w:numPr>
-        <w:pStyle w:val="ListNumber"/>
-      </w:pPr>
-      <w:r>
-        <w:t>First step in the process</w:t>
-      </w:r>
-    </w:p>
-    <w:p>
-      <w:pPr>
-        <w:numPr>
-          <w:ilvl w:val="0"/>
-          <w:numId w:val="23"/>
-        </w:numPr>
-        <w:pStyle w:val="ListNumber"/>
-      </w:pPr>
-      <w:r>
-        <w:t>Second step with specific details</w:t>
-      </w:r>
-    </w:p>
-    <w:p>
-      <w:pPr>
-        <w:numPr>
-          <w:ilvl w:val="0"/>
-          <w:numId w:val="23"/>
-        </w:numPr>
-        <w:pStyle w:val="ListNumber"/>
-      </w:pPr>
-      <w:r>
-        <w:t>Third step completing the sequence</w:t>
-      </w:r>
-    </w:p>
-    <w:p>
-      <w:bookmarkStart w:id="78" w:name="h-nested-lists"/>
-      <w:pPr>
-        <w:pStyle w:val="Heading2"/>
-      </w:pPr>
-      <w:r>
-        <w:t>Nested Lists</w:t>
-      </w:r>
-      <w:bookmarkEnd w:id="78"/>
-    </w:p>
-    <w:p>
-      <w:r>
-        <w:t>Lists can be nested to show hierarchical relationships:</w:t>
-      </w:r>
-    </w:p>
-    <w:p>
-      <w:pPr>
-        <w:numPr>
-          <w:ilvl w:val="0"/>
-          <w:numId w:val="24"/>
-        </w:numPr>
-        <w:pStyle w:val="ListNumber"/>
-      </w:pPr>
-      <w:r>
-        <w:rPr>
-          <w:b/>
-        </w:rPr>
-        <w:t>Main category A</w:t>
-      </w:r>
-    </w:p>
-    <w:p>
-      <w:pPr>
-        <w:numPr>
-          <w:ilvl w:val="1"/>
-          <w:numId w:val="24"/>
-        </w:numPr>
-        <w:pStyle w:val="ListBullet2"/>
-      </w:pPr>
-      <w:r>
-        <w:t>Sub-item A.1</w:t>
-      </w:r>
-    </w:p>
-    <w:p>
-      <w:pPr>
-        <w:numPr>
-          <w:ilvl w:val="1"/>
-          <w:numId w:val="24"/>
-        </w:numPr>
-        <w:pStyle w:val="ListBullet2"/>
-      </w:pPr>
-      <w:r>
-        <w:t>Sub-item A.2</w:t>
-      </w:r>
-    </w:p>
-    <w:p>
-      <w:pPr>
-        <w:numPr>
-          <w:ilvl w:val="2"/>
-          <w:numId w:val="24"/>
-        </w:numPr>
-        <w:pStyle w:val="ListBullet3"/>
-      </w:pPr>
-      <w:r>
-        <w:t>Detail A.2.1</w:t>
-      </w:r>
-    </w:p>
-    <w:p>
-      <w:pPr>
-        <w:numPr>
-          <w:ilvl w:val="2"/>
-          <w:numId w:val="24"/>
-        </w:numPr>
-        <w:pStyle w:val="ListBullet3"/>
-      </w:pPr>
-      <w:r>
-        <w:t>Detail A.2.2</w:t>
-      </w:r>
-    </w:p>
-    <w:p>
-      <w:pPr>
-        <w:numPr>
-          <w:ilvl w:val="1"/>
-          <w:numId w:val="24"/>
-        </w:numPr>
-        <w:pStyle w:val="ListBullet2"/>
-      </w:pPr>
-      <w:r>
-        <w:t>Sub-item A.3</w:t>
-      </w:r>
-    </w:p>
-    <w:p>
-      <w:pPr>
-        <w:numPr>
-          <w:ilvl w:val="0"/>
-          <w:numId w:val="24"/>
-        </w:numPr>
-        <w:pStyle w:val="ListNumber"/>
-      </w:pPr>
-      <w:r>
-        <w:rPr>
-          <w:b/>
-        </w:rPr>
-        <w:t>Main category B</w:t>
-      </w:r>
-    </w:p>
-    <w:p>
-      <w:pPr>
-        <w:numPr>
-          <w:ilvl w:val="1"/>
-          <w:numId w:val="24"/>
-        </w:numPr>
-        <w:pStyle w:val="ListBullet2"/>
-      </w:pPr>
-      <w:r>
-        <w:t>Sub-item B.1</w:t>
-      </w:r>
-    </w:p>
-    <w:p>
-      <w:pPr>
-        <w:numPr>
-          <w:ilvl w:val="1"/>
-          <w:numId w:val="24"/>
-        </w:numPr>
-        <w:pStyle w:val="ListBullet2"/>
-      </w:pPr>
-      <w:r>
-        <w:t>Sub-item B.2</w:t>
-      </w:r>
-    </w:p>
-    <w:p>
-      <w:pPr>
-        <w:numPr>
-          <w:ilvl w:val="0"/>
-          <w:numId w:val="24"/>
-        </w:numPr>
-        <w:pStyle w:val="ListNumber"/>
-      </w:pPr>
-      <w:r>
-        <w:rPr>
-          <w:b/>
-        </w:rPr>
-        <w:t>Main category C</w:t>
-      </w:r>
-    </w:p>
-    <w:p>
-      <w:pPr>
-        <w:numPr>
-          <w:ilvl w:val="1"/>
-          <w:numId w:val="24"/>
-        </w:numPr>
-        <w:pStyle w:val="ListBullet2"/>
-      </w:pPr>
-      <w:r>
-        <w:t>Sub-item C.1</w:t>
-      </w:r>
-    </w:p>
-    <w:p>
-      <w:r>
-        <w:t>This demonstrates the converter's ability to handle complex list structures with proper indentation and formatting.</w:t>
-      </w:r>
-    </w:p>
-    <w:p>
-      <w:bookmarkStart w:id="79" w:name="h-tables"/>
-      <w:pPr>
-        <w:pStyle w:val="Heading1"/>
-        <w:pageBreakBefore w:val="1"/>
-      </w:pPr>
-      <w:r>
-        <w:t>Tables</w:t>
-      </w:r>
-      <w:bookmarkEnd w:id="79"/>
-    </w:p>
-    <w:p>
-      <w:bookmarkStart w:id="80" w:name="h-standard-data-table"/>
-      <w:pPr>
-        <w:pStyle w:val="Heading2"/>
-      </w:pPr>
-      <w:r>
-        <w:t>Standard Data Table</w:t>
-      </w:r>
-      <w:bookmarkEnd w:id="80"/>
-    </w:p>
-    <w:p>
-      <w:r>
-        <w:t>Tables support headers, alternating row shading, and full-width formatting:</w:t>
-      </w:r>
-    </w:p>
-    <w:tbl>
-      <w:tblPr>
-        <w:tblStyle w:val="MdToDocxDataTable"/>
-        <w:tblLook w:firstColumn="0" w:firstRow="1" w:lastColumn="0" w:lastRow="0" w:noHBand="0" w:noVBand="1" w:val="0420"/>
-        <w:tblW w:w="5000" w:type="pct"/>
-      </w:tblPr>
-      <w:tblGrid>
-        <w:gridCol w:w="2340"/>
-        <w:gridCol w:w="2340"/>
-        <w:gridCol w:w="2340"/>
-        <w:gridCol w:w="2340"/>
-      </w:tblGrid>
-      <w:tr>
-        <w:trPr>
-          <w:cantSplit w:val="1"/>
-        </w:trPr>
-        <w:tc>
-          <w:tcPr>
-            <w:tcW w:type="dxa" w:w="2340"/>
-          </w:tcPr>
-          <w:p>
-            <w:r>
-              <w:t>Feature</w:t>
-            </w:r>
-          </w:p>
-        </w:tc>
-        <w:tc>
-          <w:tcPr>
-            <w:tcW w:type="dxa" w:w="2340"/>
-          </w:tcPr>
-          <w:p>
-            <w:r>
-              <w:t>Status</w:t>
-            </w:r>
-          </w:p>
-        </w:tc>
-        <w:tc>
-          <w:tcPr>
-            <w:tcW w:type="dxa" w:w="2340"/>
-          </w:tcPr>
-          <w:p>
-            <w:r>
-              <w:t>Priority</w:t>
-            </w:r>
-          </w:p>
-        </w:tc>
-        <w:tc>
-          <w:tcPr>
-            <w:tcW w:type="dxa" w:w="2340"/>
-          </w:tcPr>
-          <w:p>
-            <w:r>
-              <w:t>Notes</w:t>
-            </w:r>
-          </w:p>
-        </w:tc>
-      </w:tr>
-      <w:tr>
-        <w:trPr>
-          <w:cantSplit w:val="1"/>
-        </w:trPr>
-        <w:tc>
-          <w:tcPr>
-            <w:tcW w:type="dxa" w:w="2340"/>
-          </w:tcPr>
-          <w:p>
-            <w:r>
-              <w:t>Heading Numbering</w:t>
-            </w:r>
-          </w:p>
-        </w:tc>
-        <w:tc>
-          <w:tcPr>
-            <w:tcW w:type="dxa" w:w="2340"/>
-          </w:tcPr>
-          <w:p>
-            <w:r>
-              <w:t>Implemented</w:t>
-            </w:r>
-          </w:p>
-        </w:tc>
-        <w:tc>
-          <w:tcPr>
-            <w:tcW w:type="dxa" w:w="2340"/>
-          </w:tcPr>
-          <w:p>
-            <w:r>
-              <w:t>High</w:t>
-            </w:r>
-          </w:p>
-        </w:tc>
-        <w:tc>
-          <w:tcPr>
-            <w:tcW w:type="dxa" w:w="2340"/>
-          </w:tcPr>
-          <w:p>
-            <w:r>
-              <w:t>Configurable via YAML</w:t>
-            </w:r>
-          </w:p>
-        </w:tc>
-      </w:tr>
-      <w:tr>
-        <w:trPr>
-          <w:cantSplit w:val="1"/>
-        </w:trPr>
-        <w:tc>
-          <w:tcPr>
-            <w:tcW w:type="dxa" w:w="2340"/>
-          </w:tcPr>
-          <w:p>
-            <w:r>
-              <w:t>Cross-references</w:t>
-            </w:r>
-          </w:p>
-        </w:tc>
-        <w:tc>
-          <w:tcPr>
-            <w:tcW w:type="dxa" w:w="2340"/>
-          </w:tcPr>
-          <w:p>
-            <w:r>
-              <w:t>Implemented</w:t>
-            </w:r>
-          </w:p>
-        </w:tc>
-        <w:tc>
-          <w:tcPr>
-            <w:tcW w:type="dxa" w:w="2340"/>
-          </w:tcPr>
-          <w:p>
-            <w:r>
-              <w:t>High</w:t>
-            </w:r>
-          </w:p>
-        </w:tc>
-        <w:tc>
-          <w:tcPr>
-            <w:tcW w:type="dxa" w:w="2340"/>
-          </w:tcPr>
-          <w:p>
-            <w:r>
-              <w:t>Bold + Italic style</w:t>
-            </w:r>
-          </w:p>
-        </w:tc>
-      </w:tr>
-      <w:tr>
-        <w:trPr>
-          <w:cantSplit w:val="1"/>
-        </w:trPr>
-        <w:tc>
-          <w:tcPr>
-            <w:tcW w:type="dxa" w:w="2340"/>
-          </w:tcPr>
-          <w:p>
-            <w:r>
-              <w:t>Image Resizing</w:t>
-            </w:r>
-          </w:p>
-        </w:tc>
-        <w:tc>
-          <w:tcPr>
-            <w:tcW w:type="dxa" w:w="2340"/>
-          </w:tcPr>
-          <w:p>
-            <w:r>
-              <w:t>Implemented</w:t>
-            </w:r>
-          </w:p>
-        </w:tc>
-        <w:tc>
-          <w:tcPr>
-            <w:tcW w:type="dxa" w:w="2340"/>
-          </w:tcPr>
-          <w:p>
-            <w:r>
-              <w:t>Medium</w:t>
-            </w:r>
-          </w:p>
-        </w:tc>
-        <w:tc>
-          <w:tcPr>
-            <w:tcW w:type="dxa" w:w="2340"/>
-          </w:tcPr>
-          <w:p>
-            <w:r>
-              <w:t>Size classes supported</w:t>
-            </w:r>
-          </w:p>
-        </w:tc>
-      </w:tr>
-      <w:tr>
-        <w:trPr>
-          <w:cantSplit w:val="1"/>
-        </w:trPr>
-        <w:tc>
-          <w:tcPr>
-            <w:tcW w:type="dxa" w:w="2340"/>
-          </w:tcPr>
-          <w:p>
-            <w:r>
-              <w:t>Table Styling</w:t>
-            </w:r>
-          </w:p>
-        </w:tc>
-        <w:tc>
-          <w:tcPr>
-            <w:tcW w:type="dxa" w:w="2340"/>
-          </w:tcPr>
-          <w:p>
-            <w:r>
-              <w:t>Implemented</w:t>
-            </w:r>
-          </w:p>
-        </w:tc>
-        <w:tc>
-          <w:tcPr>
-            <w:tcW w:type="dxa" w:w="2340"/>
-          </w:tcPr>
-          <w:p>
-            <w:r>
-              <w:t>High</w:t>
-            </w:r>
-          </w:p>
-        </w:tc>
-        <w:tc>
-          <w:tcPr>
-            <w:tcW w:type="dxa" w:w="2340"/>
-          </w:tcPr>
-          <w:p>
-            <w:r>
-              <w:t>Auto-formatting applied</w:t>
-            </w:r>
-          </w:p>
-        </w:tc>
-      </w:tr>
-      <w:tr>
-        <w:trPr>
-          <w:cantSplit w:val="1"/>
-        </w:trPr>
-        <w:tc>
-          <w:tcPr>
-            <w:tcW w:type="dxa" w:w="2340"/>
-          </w:tcPr>
-          <w:p>
-            <w:r>
-              <w:t>Code Blocks</w:t>
-            </w:r>
-          </w:p>
-        </w:tc>
-        <w:tc>
-          <w:tcPr>
-            <w:tcW w:type="dxa" w:w="2340"/>
-          </w:tcPr>
-          <w:p>
-            <w:r>
-              <w:t>Implemented</w:t>
-            </w:r>
-          </w:p>
-        </w:tc>
-        <w:tc>
-          <w:tcPr>
-            <w:tcW w:type="dxa" w:w="2340"/>
-          </w:tcPr>
-          <w:p>
-            <w:r>
-              <w:t>Medium</w:t>
-            </w:r>
-          </w:p>
-        </w:tc>
-        <w:tc>
-          <w:tcPr>
-            <w:tcW w:type="dxa" w:w="2340"/>
-          </w:tcPr>
-          <w:p>
-            <w:r>
-              <w:t>Syntax highlighting</w:t>
-            </w:r>
-          </w:p>
-        </w:tc>
-      </w:tr>
-    </w:tbl>
-    <w:p>
-      <w:bookmarkStart w:id="81" w:name="tbl-feature-status"/>
-      <w:pPr>
-        <w:pStyle w:val="Caption"/>
-        <w:jc w:val="center"/>
-      </w:pPr>
-      <w:r>
-        <w:rPr>
-          <w:b/>
-          <w:i/>
-        </w:rPr>
-        <w:t>Table 4:</w:t>
-      </w:r>
-      <w:r>
-        <w:rPr>
-          <w:b w:val="0"/>
-          <w:i/>
-        </w:rPr>
-        <w:t xml:space="preserve"> Feature implementation status and priorities.</w:t>
-      </w:r>
-      <w:bookmarkEnd w:id="81"/>
-    </w:p>
-    <w:p>
-      <w:r>
-        <w:t xml:space="preserve">As shown in </w:t>
-      </w:r>
-      <w:hyperlink w:anchor="tbl-feature-status">
-        <w:r>
-          <w:rPr>
-            <w:rStyle w:val="Hyperlink"/>
-            <w:color w:val="0563C1"/>
-            <w:u w:val="single"/>
-          </w:rPr>
-          <w:t xml:space="preserve">Table 4</w:t>
-        </w:r>
-      </w:hyperlink>
-      <w:r>
-        <w:t>, all major features have been successfully implemented with appropriate priority levels assigned.</w:t>
-      </w:r>
-    </w:p>
-    <w:p>
-      <w:bookmarkStart w:id="82" w:name="h-table-without-header"/>
-      <w:pPr>
-        <w:pStyle w:val="Heading2"/>
-      </w:pPr>
-      <w:r>
-        <w:t>Table Without Header</w:t>
-      </w:r>
-      <w:bookmarkEnd w:id="82"/>
-    </w:p>
-    <w:p>
-      <w:r>
-        <w:t>Simple tables without headers are also supported:</w:t>
-      </w:r>
-    </w:p>
-    <w:tbl>
-      <w:tblPr>
-        <w:tblStyle w:val="MdToDocxDataTable"/>
-        <w:tblLook w:firstColumn="0" w:firstRow="0" w:lastColumn="0" w:lastRow="0" w:noHBand="0" w:noVBand="1" w:val="0400"/>
-        <w:tblW w:w="5000" w:type="pct"/>
-      </w:tblPr>
-      <w:tblGrid>
-        <w:gridCol w:w="2340"/>
-        <w:gridCol w:w="2340"/>
-        <w:gridCol w:w="2340"/>
-        <w:gridCol w:w="2340"/>
-      </w:tblGrid>
-      <w:tr>
-        <w:trPr>
-          <w:cantSplit w:val="1"/>
-        </w:trPr>
-        <w:tc>
-          <w:tcPr>
-            <w:tcW w:type="dxa" w:w="2340"/>
-          </w:tcPr>
-          <w:p>
-            <w:r>
-              <w:t>Row 1, Cell 1</w:t>
-            </w:r>
-          </w:p>
-        </w:tc>
-        <w:tc>
-          <w:tcPr>
-            <w:tcW w:type="dxa" w:w="2340"/>
-          </w:tcPr>
-          <w:p>
-            <w:r>
-              <w:t>Row 1, Cell 2</w:t>
-            </w:r>
-          </w:p>
-        </w:tc>
-        <w:tc>
-          <w:tcPr>
-            <w:tcW w:type="dxa" w:w="2340"/>
-          </w:tcPr>
-          <w:p>
-            <w:r>
-              <w:t>Row 1, Cell 3</w:t>
-            </w:r>
-          </w:p>
-        </w:tc>
-        <w:tc>
-          <w:tcPr>
-            <w:tcW w:type="dxa" w:w="2340"/>
-          </w:tcPr>
-          <w:p>
-            <w:r>
-              <w:t>Row 1, Cell 4</w:t>
-            </w:r>
-          </w:p>
-        </w:tc>
-      </w:tr>
-      <w:tr>
-        <w:trPr>
-          <w:cantSplit w:val="1"/>
-        </w:trPr>
-        <w:tc>
-          <w:tcPr>
-            <w:tcW w:type="dxa" w:w="2340"/>
-          </w:tcPr>
-          <w:p>
-            <w:r>
-              <w:t>Row 2, Cell 1</w:t>
-            </w:r>
-          </w:p>
-        </w:tc>
-        <w:tc>
-          <w:tcPr>
-            <w:tcW w:type="dxa" w:w="2340"/>
-          </w:tcPr>
-          <w:p>
-            <w:r>
-              <w:t>Row 2, Cell 2</w:t>
-            </w:r>
-          </w:p>
-        </w:tc>
-        <w:tc>
-          <w:tcPr>
-            <w:tcW w:type="dxa" w:w="2340"/>
-          </w:tcPr>
-          <w:p>
-            <w:r>
-              <w:t>Row 2, Cell 3</w:t>
-            </w:r>
-          </w:p>
-        </w:tc>
-        <w:tc>
-          <w:tcPr>
-            <w:tcW w:type="dxa" w:w="2340"/>
-          </w:tcPr>
-          <w:p>
-            <w:r>
-              <w:t>Row 2, Cell 4</w:t>
-            </w:r>
-          </w:p>
-        </w:tc>
-      </w:tr>
-      <w:tr>
-        <w:trPr>
-          <w:cantSplit w:val="1"/>
-        </w:trPr>
-        <w:tc>
-          <w:tcPr>
-            <w:tcW w:type="dxa" w:w="2340"/>
-          </w:tcPr>
-          <w:p>
-            <w:r>
-              <w:t>Row 3, Cell 1</w:t>
-            </w:r>
-          </w:p>
-        </w:tc>
-        <w:tc>
-          <w:tcPr>
-            <w:tcW w:type="dxa" w:w="2340"/>
-          </w:tcPr>
-          <w:p>
-            <w:r>
-              <w:t>Row 3, Cell 2</w:t>
-            </w:r>
-          </w:p>
-        </w:tc>
-        <w:tc>
-          <w:tcPr>
-            <w:tcW w:type="dxa" w:w="2340"/>
-          </w:tcPr>
-          <w:p>
-            <w:r>
-              <w:t>Row 3, Cell 3</w:t>
-            </w:r>
-          </w:p>
-        </w:tc>
-        <w:tc>
-          <w:tcPr>
-            <w:tcW w:type="dxa" w:w="2340"/>
-          </w:tcPr>
-          <w:p>
-            <w:r>
-              <w:t>Row 3, Cell 4</w:t>
-            </w:r>
-          </w:p>
-        </w:tc>
-      </w:tr>
-    </w:tbl>
-    <w:p>
-      <w:bookmarkStart w:id="83" w:name="tbl-9"/>
-      <w:pPr>
-        <w:pStyle w:val="Caption"/>
-        <w:jc w:val="center"/>
-      </w:pPr>
-      <w:r>
-        <w:rPr>
-          <w:b/>
-          <w:i/>
-        </w:rPr>
-        <w:t>Table 9:</w:t>
-      </w:r>
-      <w:r>
-        <w:rPr>
-          <w:b w:val="0"/>
-          <w:i/>
-        </w:rPr>
-        <w:t xml:space="preserve"> Data visualization example without headers.</w:t>
-      </w:r>
-      <w:bookmarkEnd w:id="83"/>
-    </w:p>
-    <w:p>
-      <w:bookmarkStart w:id="84" w:name="h-wide-table-with-text-wrapping"/>
-      <w:pPr>
-        <w:pStyle w:val="Heading2"/>
-      </w:pPr>
-      <w:r>
-        <w:t>Wide Table with Text Wrapping</w:t>
-      </w:r>
-      <w:bookmarkEnd w:id="84"/>
-    </w:p>
-    <w:p>
-      <w:r>
-        <w:t>Tables automatically handle text wrapping for content that exceeds column widths:</w:t>
-      </w:r>
-    </w:p>
-    <w:tbl>
-      <w:tblPr>
-        <w:tblStyle w:val="MdToDocxDataTable"/>
-        <w:tblLook w:firstColumn="0" w:firstRow="1" w:lastColumn="0" w:lastRow="0" w:noHBand="0" w:noVBand="1" w:val="0420"/>
-        <w:tblW w:w="5000" w:type="pct"/>
-      </w:tblPr>
-      <w:tblGrid>
-        <w:gridCol w:w="2340"/>
-        <w:gridCol w:w="2340"/>
-        <w:gridCol w:w="2340"/>
-        <w:gridCol w:w="2340"/>
-      </w:tblGrid>
-      <w:tr>
-        <w:trPr>
-          <w:cantSplit w:val="1"/>
-        </w:trPr>
-        <w:tc>
-          <w:tcPr>
-            <w:tcW w:type="dxa" w:w="2340"/>
-          </w:tcPr>
-          <w:p>
-            <w:r>
-              <w:t>Component</w:t>
-            </w:r>
-          </w:p>
-        </w:tc>
-        <w:tc>
-          <w:tcPr>
-            <w:tcW w:type="dxa" w:w="2340"/>
-          </w:tcPr>
-          <w:p>
-            <w:r>
-              <w:t>Description</w:t>
-            </w:r>
-          </w:p>
-        </w:tc>
-        <w:tc>
-          <w:tcPr>
-            <w:tcW w:type="dxa" w:w="2340"/>
-          </w:tcPr>
-          <w:p>
-            <w:r>
-              <w:t>Implementation Details</w:t>
-            </w:r>
-          </w:p>
-        </w:tc>
-        <w:tc>
-          <w:tcPr>
-            <w:tcW w:type="dxa" w:w="2340"/>
-          </w:tcPr>
-          <w:p>
-            <w:r>
-              <w:t>Status</w:t>
-            </w:r>
-          </w:p>
-        </w:tc>
-      </w:tr>
-      <w:tr>
-        <w:trPr>
-          <w:cantSplit w:val="1"/>
-        </w:trPr>
-        <w:tc>
-          <w:tcPr>
-            <w:tcW w:type="dxa" w:w="2340"/>
-          </w:tcPr>
-          <w:p>
-            <w:r>
-              <w:t>Parser</w:t>
-            </w:r>
-          </w:p>
-        </w:tc>
-        <w:tc>
-          <w:tcPr>
-            <w:tcW w:type="dxa" w:w="2340"/>
-          </w:tcPr>
-          <w:p>
-            <w:r>
-              <w:t>Marko library with GFM extensions</w:t>
-            </w:r>
-          </w:p>
-        </w:tc>
-        <w:tc>
-          <w:tcPr>
-            <w:tcW w:type="dxa" w:w="2340"/>
-          </w:tcPr>
-          <w:p>
-            <w:r>
-              <w:t>Handles all standard Markdown plus GitHub-style alerts and tables</w:t>
-            </w:r>
-          </w:p>
-        </w:tc>
-        <w:tc>
-          <w:tcPr>
-            <w:tcW w:type="dxa" w:w="2340"/>
-          </w:tcPr>
-          <w:p>
-            <w:r>
-              <w:t>Active</w:t>
-            </w:r>
-          </w:p>
-        </w:tc>
-      </w:tr>
-      <w:tr>
-        <w:trPr>
-          <w:cantSplit w:val="1"/>
-        </w:trPr>
-        <w:tc>
-          <w:tcPr>
-            <w:tcW w:type="dxa" w:w="2340"/>
-          </w:tcPr>
-          <w:p>
-            <w:r>
-              <w:t>Builder</w:t>
-            </w:r>
-          </w:p>
-        </w:tc>
-        <w:tc>
-          <w:tcPr>
-            <w:tcW w:type="dxa" w:w="2340"/>
-          </w:tcPr>
-          <w:p>
-            <w:r>
-              <w:t>Document assembly engine</w:t>
-            </w:r>
-          </w:p>
-        </w:tc>
-        <w:tc>
-          <w:tcPr>
-            <w:tcW w:type="dxa" w:w="2340"/>
-          </w:tcPr>
-          <w:p>
-            <w:r>
-              <w:t>Manages section breaks, page numbering, and TOC generation</w:t>
-            </w:r>
-          </w:p>
-        </w:tc>
-        <w:tc>
-          <w:tcPr>
-            <w:tcW w:type="dxa" w:w="2340"/>
-          </w:tcPr>
-          <w:p>
-            <w:r>
-              <w:t>Active</w:t>
-            </w:r>
-          </w:p>
-        </w:tc>
-      </w:tr>
-      <w:tr>
-        <w:trPr>
-          <w:cantSplit w:val="1"/>
-        </w:trPr>
-        <w:tc>
-          <w:tcPr>
-            <w:tcW w:type="dxa" w:w="2340"/>
-          </w:tcPr>
-          <w:p>
-            <w:r>
-              <w:t>Styles</w:t>
-            </w:r>
-          </w:p>
-        </w:tc>
-        <w:tc>
-          <w:tcPr>
-            <w:tcW w:type="dxa" w:w="2340"/>
-          </w:tcPr>
-          <w:p>
-            <w:r>
-              <w:t>Custom style definitions</w:t>
-            </w:r>
-          </w:p>
-        </w:tc>
-        <w:tc>
-          <w:tcPr>
-            <w:tcW w:type="dxa" w:w="2340"/>
-          </w:tcPr>
-          <w:p>
-            <w:r>
-              <w:t>Heading hierarchy, code blocks, captions, and alerts</w:t>
-            </w:r>
-          </w:p>
-        </w:tc>
-        <w:tc>
-          <w:tcPr>
-            <w:tcW w:type="dxa" w:w="2340"/>
-          </w:tcPr>
-          <w:p>
-            <w:r>
-              <w:t>Active</w:t>
-            </w:r>
-          </w:p>
-        </w:tc>
-      </w:tr>
-      <w:tr>
-        <w:trPr>
-          <w:cantSplit w:val="1"/>
-        </w:trPr>
-        <w:tc>
-          <w:tcPr>
-            <w:tcW w:type="dxa" w:w="2340"/>
-          </w:tcPr>
-          <w:p>
-            <w:r>
-              <w:t>Images</w:t>
-            </w:r>
-          </w:p>
-        </w:tc>
-        <w:tc>
-          <w:tcPr>
-            <w:tcW w:type="dxa" w:w="2340"/>
-          </w:tcPr>
-          <w:p>
-            <w:r>
-              <w:t>Processing pipeline</w:t>
-            </w:r>
-          </w:p>
-        </w:tc>
-        <w:tc>
-          <w:tcPr>
-            <w:tcW w:type="dxa" w:w="2340"/>
-          </w:tcPr>
-          <w:p>
-            <w:r>
-              <w:t>Size calculation, aspect ratio preservation, placement</w:t>
-            </w:r>
-          </w:p>
-        </w:tc>
-        <w:tc>
-          <w:tcPr>
-            <w:tcW w:type="dxa" w:w="2340"/>
-          </w:tcPr>
-          <w:p>
-            <w:r>
-              <w:t>Active</w:t>
-            </w:r>
-          </w:p>
-        </w:tc>
-      </w:tr>
-    </w:tbl>
-    <w:p>
-      <w:bookmarkStart w:id="85" w:name="tbl-architecture"/>
-      <w:pPr>
-        <w:pStyle w:val="Caption"/>
-        <w:jc w:val="center"/>
-      </w:pPr>
-      <w:r>
-        <w:rPr>
-          <w:b/>
-          <w:i/>
-        </w:rPr>
-        <w:t>Table 5:</w:t>
-      </w:r>
-      <w:r>
-        <w:rPr>
-          <w:b w:val="0"/>
-          <w:i/>
-        </w:rPr>
-        <w:t xml:space="preserve"> System architecture components with detailed descriptions.</w:t>
-      </w:r>
-      <w:bookmarkEnd w:id="85"/>
-    </w:p>
-    <w:p>
-      <w:r>
-        <w:t xml:space="preserve">Refer to </w:t>
-      </w:r>
-      <w:hyperlink w:anchor="tbl-architecture">
-        <w:r>
-          <w:rPr>
-            <w:rStyle w:val="Hyperlink"/>
-            <w:color w:val="0563C1"/>
-            <w:u w:val="single"/>
-          </w:rPr>
-          <w:t xml:space="preserve">Table 5</w:t>
-        </w:r>
-      </w:hyperlink>
-      <w:r>
-        <w:t xml:space="preserve"> for a complete overview of the system architecture.</w:t>
-      </w:r>
-    </w:p>
-    <w:p>
-      <w:bookmarkStart w:id="86" w:name="h-table-with-custom-column-widths"/>
-      <w:pPr>
-        <w:pStyle w:val="Heading2"/>
-      </w:pPr>
-      <w:r>
-        <w:t>Table with Custom Column Widths</w:t>
-      </w:r>
-      <w:bookmarkEnd w:id="86"/>
-    </w:p>
-    <w:p>
-      <w:r>
-        <w:t xml:space="preserve">Tables can have custom column widths specified as percentages using the </w:t>
-      </w:r>
-      <w:r>
-        <w:rPr>
-          <w:rFonts w:ascii="Courier New" w:hAnsi="Courier New"/>
-          <w:sz w:val="20"/>
-        </w:rPr>
-        <w:t>{col-widths="..."}</w:t>
-      </w:r>
-      <w:r>
-        <w:t xml:space="preserve"> directive placed immediately after the table:</w:t>
-      </w:r>
-    </w:p>
-    <w:tbl>
-      <w:tblPr>
-        <w:tblStyle w:val="MdToDocxDataTable"/>
-        <w:tblLook w:firstColumn="0" w:firstRow="1" w:lastColumn="0" w:lastRow="0" w:noHBand="0" w:noVBand="1" w:val="0420"/>
-        <w:tblW w:w="9360" w:type="dxa"/>
-      </w:tblPr>
-      <w:tblGrid>
-        <w:gridCol w:w="1404"/>
-        <w:gridCol w:w="2340"/>
-        <w:gridCol w:w="5616"/>
-      </w:tblGrid>
-      <w:tr>
-        <w:trPr>
-          <w:cantSplit w:val="1"/>
-        </w:trPr>
-        <w:tc>
-          <w:tcPr>
-            <w:tcW w:w="1404" w:type="dxa"/>
-          </w:tcPr>
-          <w:p>
-            <w:r>
-              <w:t>Short</w:t>
-            </w:r>
-          </w:p>
-        </w:tc>
-        <w:tc>
-          <w:tcPr>
-            <w:tcW w:w="2340" w:type="dxa"/>
-          </w:tcPr>
-          <w:p>
-            <w:r>
-              <w:t>Medium</w:t>
-            </w:r>
-          </w:p>
-        </w:tc>
-        <w:tc>
-          <w:tcPr>
-            <w:tcW w:w="5616" w:type="dxa"/>
-          </w:tcPr>
-          <w:p>
-            <w:r>
-              <w:t>Long Description</w:t>
-            </w:r>
-          </w:p>
-        </w:tc>
-      </w:tr>
-      <w:tr>
-        <w:trPr>
-          <w:cantSplit w:val="1"/>
-        </w:trPr>
-        <w:tc>
-          <w:tcPr>
-            <w:tcW w:w="1404" w:type="dxa"/>
-          </w:tcPr>
-          <w:p>
-            <w:r>
-              <w:t>ID</w:t>
-            </w:r>
-          </w:p>
-        </w:tc>
-        <w:tc>
-          <w:tcPr>
-            <w:tcW w:w="2340" w:type="dxa"/>
-          </w:tcPr>
-          <w:p>
-            <w:r>
-              <w:t>Category</w:t>
-            </w:r>
-          </w:p>
-        </w:tc>
-        <w:tc>
-          <w:tcPr>
-            <w:tcW w:w="5616" w:type="dxa"/>
-          </w:tcPr>
-          <w:p>
-            <w:r>
-              <w:t>Detailed explanation of the feature or component</w:t>
-            </w:r>
-          </w:p>
-        </w:tc>
-      </w:tr>
-      <w:tr>
-        <w:trPr>
-          <w:cantSplit w:val="1"/>
-        </w:trPr>
-        <w:tc>
-          <w:tcPr>
-            <w:tcW w:w="1404" w:type="dxa"/>
-          </w:tcPr>
-          <w:p>
-            <w:r>
-              <w:t>001</w:t>
-            </w:r>
-          </w:p>
-        </w:tc>
-        <w:tc>
-          <w:tcPr>
-            <w:tcW w:w="2340" w:type="dxa"/>
-          </w:tcPr>
-          <w:p>
-            <w:r>
-              <w:t>Parser</w:t>
-            </w:r>
-          </w:p>
-        </w:tc>
-        <w:tc>
-          <w:tcPr>
-            <w:tcW w:w="5616" w:type="dxa"/>
-          </w:tcPr>
-          <w:p>
-            <w:r>
-              <w:t>Handles Markdown syntax parsing with GFM extensions</w:t>
-            </w:r>
-          </w:p>
-        </w:tc>
-      </w:tr>
-      <w:tr>
-        <w:trPr>
-          <w:cantSplit w:val="1"/>
-        </w:trPr>
-        <w:tc>
-          <w:tcPr>
-            <w:tcW w:w="1404" w:type="dxa"/>
-          </w:tcPr>
-          <w:p>
-            <w:r>
-              <w:t>002</w:t>
-            </w:r>
-          </w:p>
-        </w:tc>
-        <w:tc>
-          <w:tcPr>
-            <w:tcW w:w="2340" w:type="dxa"/>
-          </w:tcPr>
-          <w:p>
-            <w:r>
-              <w:t>Builder</w:t>
-            </w:r>
-          </w:p>
-        </w:tc>
-        <w:tc>
-          <w:tcPr>
-            <w:tcW w:w="5616" w:type="dxa"/>
-          </w:tcPr>
-          <w:p>
-            <w:r>
-              <w:t>Assembles the document structure and applies formatting</w:t>
-            </w:r>
-          </w:p>
-        </w:tc>
-      </w:tr>
-    </w:tbl>
-    <w:p>
-      <w:bookmarkStart w:id="87" w:name="tbl-col-widths-example"/>
-      <w:pPr>
-        <w:pStyle w:val="Caption"/>
-        <w:jc w:val="center"/>
-      </w:pPr>
-      <w:r>
-        <w:rPr>
-          <w:b/>
-          <w:i/>
-        </w:rPr>
-        <w:t>Table 6:</w:t>
-      </w:r>
-      <w:r>
-        <w:rPr>
-          <w:b w:val="0"/>
-          <w:i/>
-        </w:rPr>
-        <w:t xml:space="preserve"> Example table with custom column width distribution.</w:t>
-      </w:r>
-      <w:bookmarkEnd w:id="87"/>
-    </w:p>
-    <w:p>
-      <w:r>
-        <w:t>In this example, the first column occupies 15% of the table width, the second column 25%, and the third column (containing longer descriptions) occupies 60% of the available space.</w:t>
-      </w:r>
-    </w:p>
-    <w:p>
-      <w:bookmarkStart w:id="88" w:name="h-images-and-figures"/>
-      <w:pPr>
-        <w:pStyle w:val="Heading1"/>
-        <w:pageBreakBefore w:val="1"/>
-      </w:pPr>
-      <w:r>
-        <w:t>Images and Figures</w:t>
-      </w:r>
-      <w:bookmarkEnd w:id="88"/>
-    </w:p>
-    <w:p>
-      <w:bookmarkStart w:id="89" w:name="h-standalone-images"/>
-      <w:pPr>
-        <w:pStyle w:val="Heading2"/>
-      </w:pPr>
-      <w:r>
-        <w:t>Standalone Images</w:t>
-      </w:r>
-      <w:bookmarkEnd w:id="89"/>
-    </w:p>
-    <w:p>
-      <w:bookmarkStart w:id="90" w:name="h-full-width-image"/>
-      <w:pPr>
-        <w:pStyle w:val="Heading3"/>
-      </w:pPr>
-      <w:r>
-        <w:t>Full-Width Image</w:t>
-      </w:r>
-      <w:bookmarkEnd w:id="90"/>
-    </w:p>
-    <w:p>
-      <w:r>
-        <w:t>Large images can be displayed at full content width for maximum impact:</w:t>
-      </w:r>
-    </w:p>
-    <w:p>
-      <w:pPr>
-        <w:keepNext/>
-        <w:jc w:val="center"/>
-      </w:pPr>
-      <w:r>
-        <w:drawing>
-          <wp:inline xmlns:a="http://schemas.openxmlformats.org/drawingml/2006/main" xmlns:pic="http://schemas.openxmlformats.org/drawingml/2006/picture">
-            <wp:extent cx="5733288" cy="1019251"/>
-            <wp:docPr id="7" name="Picture 7"/>
-            <wp:cNvGraphicFramePr>
-              <a:graphicFrameLocks noChangeAspect="1"/>
-            </wp:cNvGraphicFramePr>
-            <a:graphic>
-              <a:graphicData uri="http://schemas.openxmlformats.org/drawingml/2006/picture">
-                <pic:pic>
-                  <pic:nvPicPr>
-                    <pic:cNvPr id="0" name="banner.png"/>
-                    <pic:cNvPicPr/>
-                  </pic:nvPicPr>
-                  <pic:blipFill>
-                    <a:blip r:embed="rId11"/>
-                    <a:stretch>
-                      <a:fillRect/>
-                    </a:stretch>
-                  </pic:blipFill>
-                  <pic:spPr>
-                    <a:xfrm>
-                      <a:off x="0" y="0"/>
-                      <a:ext cx="5733288" cy="1019251"/>
-                    </a:xfrm>
-                    <a:prstGeom prst="rect"/>
-                  </pic:spPr>
-                </pic:pic>
-              </a:graphicData>
-            </a:graphic>
-          </wp:inline>
-        </w:drawing>
-      </w:r>
-    </w:p>
-    <w:p>
-      <w:bookmarkStart w:id="91" w:name="fig-system-overview"/>
-      <w:pPr>
-        <w:pStyle w:val="Caption"/>
-        <w:jc w:val="center"/>
-      </w:pPr>
-      <w:r>
-        <w:rPr>
-          <w:b/>
-          <w:i/>
-        </w:rPr>
-        <w:t>Figure 4:</w:t>
-      </w:r>
-      <w:r>
-        <w:rPr>
-          <w:b w:val="0"/>
-          <w:i/>
-        </w:rPr>
-        <w:t xml:space="preserve"> Complete system overview diagram showing all major components and their relationships.</w:t>
-      </w:r>
-      <w:bookmarkEnd w:id="91"/>
-    </w:p>
-    <w:p>
-      <w:r>
-        <w:t xml:space="preserve">As illustrated in </w:t>
-      </w:r>
-      <w:hyperlink w:anchor="fig-system-overview">
-        <w:r>
-          <w:rPr>
-            <w:rStyle w:val="Hyperlink"/>
-            <w:color w:val="0563C1"/>
-            <w:u w:val="single"/>
-          </w:rPr>
-          <w:t xml:space="preserve">Figure 4</w:t>
-        </w:r>
-      </w:hyperlink>
-      <w:r>
-        <w:t>, the system architecture consists of four primary modules working in concert.</w:t>
-      </w:r>
-    </w:p>
-    <w:p>
-      <w:bookmarkStart w:id="92" w:name="h-left-aligned-image"/>
-      <w:pPr>
-        <w:pStyle w:val="Heading3"/>
-      </w:pPr>
-      <w:r>
-        <w:t>Left-Aligned Image</w:t>
-      </w:r>
-      <w:bookmarkEnd w:id="92"/>
-    </w:p>
-    <w:p>
-      <w:r>
-        <w:t>Images can be positioned on the left side with text flowing alongside:</w:t>
-      </w:r>
-    </w:p>
-    <w:p>
-      <w:pPr>
-        <w:keepNext/>
-        <w:jc w:val="left"/>
-      </w:pPr>
-      <w:r>
-        <w:drawing>
-          <wp:inline xmlns:a="http://schemas.openxmlformats.org/drawingml/2006/main" xmlns:pic="http://schemas.openxmlformats.org/drawingml/2006/picture">
-            <wp:extent cx="1719986" cy="1719986"/>
-            <wp:docPr id="8" name="Picture 8"/>
-            <wp:cNvGraphicFramePr>
-              <a:graphicFrameLocks noChangeAspect="1"/>
-            </wp:cNvGraphicFramePr>
-            <a:graphic>
-              <a:graphicData uri="http://schemas.openxmlformats.org/drawingml/2006/picture">
-                <pic:pic>
-                  <pic:nvPicPr>
-                    <pic:cNvPr id="0" name="icon.png"/>
-                    <pic:cNvPicPr/>
-                  </pic:nvPicPr>
-                  <pic:blipFill>
-                    <a:blip r:embed="rId12"/>
-                    <a:stretch>
-                      <a:fillRect/>
-                    </a:stretch>
-                  </pic:blipFill>
-                  <pic:spPr>
-                    <a:xfrm>
-                      <a:off x="0" y="0"/>
-                      <a:ext cx="1719986" cy="1719986"/>
-                    </a:xfrm>
-                    <a:prstGeom prst="rect"/>
-                  </pic:spPr>
-                </pic:pic>
-              </a:graphicData>
-            </a:graphic>
-          </wp:inline>
-        </w:drawing>
-      </w:r>
-    </w:p>
-    <w:p>
-      <w:bookmarkStart w:id="93" w:name="fig-2"/>
-      <w:pPr>
-        <w:pStyle w:val="Caption"/>
-        <w:jc w:val="left"/>
-      </w:pPr>
-      <w:r>
-        <w:rPr>
-          <w:b/>
-          <w:i/>
-        </w:rPr>
-        <w:t>Figure 2:</w:t>
-      </w:r>
-      <w:r>
-        <w:rPr>
-          <w:b w:val="0"/>
-          <w:i/>
-        </w:rPr>
-        <w:t xml:space="preserve"> Individual module icon representing the parsing engine.</w:t>
-      </w:r>
-      <w:bookmarkEnd w:id="93"/>
-    </w:p>
-    <w:p>
-      <w:r>
-        <w:t>This layout demonstrates how content wraps around left-aligned images. The parsing module serves as the foundation of the conversion pipeline, responsible for transforming raw Markdown syntax into an abstract syntax tree (AST) that the builder can process.</w:t>
-      </w:r>
-    </w:p>
-    <w:p>
-      <w:bookmarkStart w:id="94" w:name="h-centered-medium-image"/>
-      <w:pPr>
-        <w:pStyle w:val="Heading3"/>
-      </w:pPr>
-      <w:r>
-        <w:t>Centered Medium Image</w:t>
-      </w:r>
-      <w:bookmarkEnd w:id="94"/>
-    </w:p>
-    <w:p>
-      <w:r>
-        <w:t>The default presentation centers images within the content area:</w:t>
-      </w:r>
-    </w:p>
-    <w:p>
-      <w:pPr>
-        <w:keepNext/>
-        <w:jc w:val="center"/>
-      </w:pPr>
-      <w:r>
-        <w:drawing>
-          <wp:inline xmlns:a="http://schemas.openxmlformats.org/drawingml/2006/main" xmlns:pic="http://schemas.openxmlformats.org/drawingml/2006/picture">
-            <wp:extent cx="2866644" cy="1719986"/>
-            <wp:docPr id="9" name="Picture 9"/>
-            <wp:cNvGraphicFramePr>
-              <a:graphicFrameLocks noChangeAspect="1"/>
-            </wp:cNvGraphicFramePr>
-            <a:graphic>
-              <a:graphicData uri="http://schemas.openxmlformats.org/drawingml/2006/picture">
-                <pic:pic>
-                  <pic:nvPicPr>
-                    <pic:cNvPr id="0" name="chart.png"/>
-                    <pic:cNvPicPr/>
-                  </pic:nvPicPr>
-                  <pic:blipFill>
-                    <a:blip r:embed="rId13"/>
-                    <a:stretch>
-                      <a:fillRect/>
-                    </a:stretch>
-                  </pic:blipFill>
-                  <pic:spPr>
-                    <a:xfrm>
-                      <a:off x="0" y="0"/>
-                      <a:ext cx="2866644" cy="1719986"/>
-                    </a:xfrm>
-                    <a:prstGeom prst="rect"/>
-                  </pic:spPr>
-                </pic:pic>
-              </a:graphicData>
-            </a:graphic>
-          </wp:inline>
-        </w:drawing>
-      </w:r>
-    </w:p>
-    <w:p>
-      <w:bookmarkStart w:id="95" w:name="fig-data-flow"/>
-      <w:pPr>
-        <w:pStyle w:val="Caption"/>
-        <w:jc w:val="center"/>
-      </w:pPr>
-      <w:r>
-        <w:rPr>
-          <w:b/>
-          <w:i/>
-        </w:rPr>
-        <w:t>Figure 5:</w:t>
-      </w:r>
-      <w:r>
-        <w:rPr>
-          <w:b w:val="0"/>
-          <w:i/>
-        </w:rPr>
-        <w:t xml:space="preserve"> Data flow diagram showing information pathways through the system.</w:t>
-      </w:r>
-      <w:bookmarkEnd w:id="95"/>
-    </w:p>
-    <w:p>
-      <w:bookmarkStart w:id="96" w:name="h-figure-groups"/>
-      <w:pPr>
-        <w:pStyle w:val="Heading2"/>
-      </w:pPr>
-      <w:r>
-        <w:t>Figure Groups</w:t>
-      </w:r>
-      <w:bookmarkEnd w:id="96"/>
-    </w:p>
-    <w:p>
-      <w:r>
-        <w:t>Multiple images can be displayed side-by-side for comparison purposes:</w:t>
-      </w:r>
-    </w:p>
-    <w:tbl>
-      <w:tblPr>
-        <w:tblLook w:firstColumn="1" w:firstRow="1" w:lastColumn="0" w:lastRow="0" w:noHBand="0" w:noVBand="1" w:val="04A0"/>
-        <w:tblW w:w="5000" w:type="pct"/>
-      </w:tblPr>
-      <w:tblGrid>
-        <w:gridCol w:w="3120"/>
-        <w:gridCol w:w="3120"/>
-        <w:gridCol w:w="3120"/>
-      </w:tblGrid>
-      <w:tr>
-        <w:tc>
-          <w:tcPr>
-            <w:tcBdr>
-              <w:top w:val="none"/>
-              <w:left w:val="none"/>
-              <w:bottom w:val="none"/>
-              <w:right w:val="none"/>
-            </w:tcBdr>
-            <w:tcMar>
-              <w:top w:w="40" w:type="dxa"/>
-              <w:bottom w:w="40" w:type="dxa"/>
-              <w:left w:w="60" w:type="dxa"/>
-              <w:right w:w="60" w:type="dxa"/>
-            </w:tcMar>
-            <w:tcW w:w="2916" w:type="dxa"/>
-          </w:tcPr>
-          <w:p>
-            <w:pPr>
-              <w:keepNext/>
-              <w:jc w:val="center"/>
-            </w:pPr>
-            <w:r>
-              <w:drawing>
-                <wp:inline xmlns:a="http://schemas.openxmlformats.org/drawingml/2006/main" xmlns:pic="http://schemas.openxmlformats.org/drawingml/2006/picture">
-                  <wp:extent cx="1834896" cy="1376172"/>
-                  <wp:docPr id="10" name="Picture 10"/>
-                  <wp:cNvGraphicFramePr>
-                    <a:graphicFrameLocks noChangeAspect="1"/>
-                  </wp:cNvGraphicFramePr>
-                  <a:graphic>
-                    <a:graphicData uri="http://schemas.openxmlformats.org/drawingml/2006/picture">
-                      <pic:pic>
-                        <pic:nvPicPr>
-                          <pic:cNvPr id="0" name="workflow_diagram.png"/>
-                          <pic:cNvPicPr/>
-                        </pic:nvPicPr>
-                        <pic:blipFill>
-                          <a:blip r:embed="rId14"/>
-                          <a:stretch>
-                            <a:fillRect/>
-                          </a:stretch>
-                        </pic:blipFill>
-                        <pic:spPr>
-                          <a:xfrm>
-                            <a:off x="0" y="0"/>
-                            <a:ext cx="1834896" cy="1376172"/>
-                          </a:xfrm>
-                          <a:prstGeom prst="rect"/>
-                        </pic:spPr>
-                      </pic:pic>
-                    </a:graphicData>
-                  </a:graphic>
-                </wp:inline>
-              </w:drawing>
-            </w:r>
-          </w:p>
-          <w:p>
-            <w:pPr>
-              <w:keepNext/>
-              <w:jc w:val="center"/>
-            </w:pPr>
-            <w:r>
-              <w:rPr>
-                <w:i/>
-                <w:color w:val="555555"/>
-                <w:sz w:val="18"/>
-              </w:rPr>
-              <w:t>a) Input Processing</w:t>
-            </w:r>
-          </w:p>
-        </w:tc>
-        <w:tc>
-          <w:tcPr>
-            <w:tcBdr>
-              <w:top w:val="none"/>
-              <w:left w:val="none"/>
-              <w:bottom w:val="none"/>
-              <w:right w:val="none"/>
-            </w:tcBdr>
-            <w:tcMar>
-              <w:top w:w="40" w:type="dxa"/>
-              <w:bottom w:w="40" w:type="dxa"/>
-              <w:left w:w="60" w:type="dxa"/>
-              <w:right w:w="60" w:type="dxa"/>
-            </w:tcMar>
-            <w:tcW w:w="2916" w:type="dxa"/>
-          </w:tcPr>
-          <w:p>
-            <w:pPr>
-              <w:keepNext/>
-              <w:jc w:val="center"/>
-            </w:pPr>
-            <w:r>
-              <w:drawing>
-                <wp:inline xmlns:a="http://schemas.openxmlformats.org/drawingml/2006/main" xmlns:pic="http://schemas.openxmlformats.org/drawingml/2006/picture">
-                  <wp:extent cx="1834896" cy="1376172"/>
-                  <wp:docPr id="11" name="Picture 11"/>
-                  <wp:cNvGraphicFramePr>
-                    <a:graphicFrameLocks noChangeAspect="1"/>
-                  </wp:cNvGraphicFramePr>
-                  <a:graphic>
-                    <a:graphicData uri="http://schemas.openxmlformats.org/drawingml/2006/picture">
-                      <pic:pic>
-                        <pic:nvPicPr>
-                          <pic:cNvPr id="0" name="architecture.png"/>
-                          <pic:cNvPicPr/>
-                        </pic:nvPicPr>
-                        <pic:blipFill>
-                          <a:blip r:embed="rId15"/>
-                          <a:stretch>
-                            <a:fillRect/>
-                          </a:stretch>
-                        </pic:blipFill>
-                        <pic:spPr>
-                          <a:xfrm>
-                            <a:off x="0" y="0"/>
-                            <a:ext cx="1834896" cy="1376172"/>
-                          </a:xfrm>
-                          <a:prstGeom prst="rect"/>
-                        </pic:spPr>
-                      </pic:pic>
-                    </a:graphicData>
-                  </a:graphic>
-                </wp:inline>
-              </w:drawing>
-            </w:r>
-          </w:p>
-          <w:p>
-            <w:pPr>
-              <w:keepNext/>
-              <w:jc w:val="center"/>
-            </w:pPr>
-            <w:r>
-              <w:rPr>
-                <w:i/>
-                <w:color w:val="555555"/>
-                <w:sz w:val="18"/>
-              </w:rPr>
-              <w:t>b) Output Generation</w:t>
-            </w:r>
-          </w:p>
-        </w:tc>
-        <w:tc>
-          <w:tcPr>
-            <w:tcBdr>
-              <w:top w:val="none"/>
-              <w:left w:val="none"/>
-              <w:bottom w:val="none"/>
-              <w:right w:val="none"/>
-            </w:tcBdr>
-            <w:tcMar>
-              <w:top w:w="40" w:type="dxa"/>
-              <w:bottom w:w="40" w:type="dxa"/>
-              <w:left w:w="60" w:type="dxa"/>
-              <w:right w:w="60" w:type="dxa"/>
-            </w:tcMar>
-            <w:tcW w:w="2916" w:type="dxa"/>
-          </w:tcPr>
-          <w:p>
-            <w:pPr>
-              <w:keepNext/>
-              <w:jc w:val="center"/>
-            </w:pPr>
-            <w:r>
-              <w:drawing>
-                <wp:inline xmlns:a="http://schemas.openxmlformats.org/drawingml/2006/main" xmlns:pic="http://schemas.openxmlformats.org/drawingml/2006/picture">
-                  <wp:extent cx="1834896" cy="1376172"/>
-                  <wp:docPr id="12" name="Picture 12"/>
-                  <wp:cNvGraphicFramePr>
-                    <a:graphicFrameLocks noChangeAspect="1"/>
-                  </wp:cNvGraphicFramePr>
-                  <a:graphic>
-                    <a:graphicData uri="http://schemas.openxmlformats.org/drawingml/2006/picture">
-                      <pic:pic>
-                        <pic:nvPicPr>
-                          <pic:cNvPr id="0" name="comparison_chart.png"/>
-                          <pic:cNvPicPr/>
-                        </pic:nvPicPr>
-                        <pic:blipFill>
-                          <a:blip r:embed="rId16"/>
-                          <a:stretch>
-                            <a:fillRect/>
-                          </a:stretch>
-                        </pic:blipFill>
-                        <pic:spPr>
-                          <a:xfrm>
-                            <a:off x="0" y="0"/>
-                            <a:ext cx="1834896" cy="1376172"/>
-                          </a:xfrm>
-                          <a:prstGeom prst="rect"/>
-                        </pic:spPr>
-                      </pic:pic>
-                    </a:graphicData>
-                  </a:graphic>
-                </wp:inline>
-              </w:drawing>
-            </w:r>
-          </w:p>
-          <w:p>
-            <w:pPr>
-              <w:keepNext/>
-              <w:jc w:val="center"/>
-            </w:pPr>
-            <w:r>
-              <w:rPr>
-                <w:i/>
-                <w:color w:val="555555"/>
-                <w:sz w:val="18"/>
-              </w:rPr>
-              <w:t>c) Quality Control</w:t>
-            </w:r>
-          </w:p>
-        </w:tc>
-      </w:tr>
-    </w:tbl>
-    <w:p>
-      <w:bookmarkStart w:id="97" w:name="fig-pipeline"/>
-      <w:pPr>
-        <w:pStyle w:val="Caption"/>
-        <w:jc w:val="center"/>
-      </w:pPr>
-      <w:r>
-        <w:rPr>
-          <w:b/>
-          <w:i/>
-        </w:rPr>
-        <w:t>Figure 6:</w:t>
-      </w:r>
-      <w:r>
-        <w:rPr>
-          <w:b w:val="0"/>
-          <w:i/>
-        </w:rPr>
-        <w:t xml:space="preserve"> Three-phase processing pipeline: input parsing, document building, and quality validation.</w:t>
-      </w:r>
-      <w:bookmarkEnd w:id="97"/>
-    </w:p>
-    <w:p>
-      <w:r>
-        <w:t xml:space="preserve">The figure group above, referenced as </w:t>
-      </w:r>
-      <w:hyperlink w:anchor="fig-pipeline">
-        <w:r>
-          <w:rPr>
-            <w:rStyle w:val="Hyperlink"/>
-            <w:color w:val="0563C1"/>
-            <w:u w:val="single"/>
-          </w:rPr>
-          <w:t xml:space="preserve">Figure 6</w:t>
-        </w:r>
-      </w:hyperlink>
-      <w:r>
-        <w:t>, demonstrates how multiple related images can be presented together with individual sub-captions (a, b, c) and an overall group caption.</w:t>
-      </w:r>
-    </w:p>
-    <w:p>
-      <w:bookmarkStart w:id="98" w:name="h-cross-references-and-linking"/>
-      <w:pPr>
-        <w:pStyle w:val="Heading1"/>
-        <w:pageBreakBefore w:val="1"/>
-      </w:pPr>
-      <w:r>
-        <w:t>Cross-References and Linking</w:t>
-      </w:r>
-      <w:bookmarkEnd w:id="98"/>
-    </w:p>
-    <w:p>
-      <w:bookmarkStart w:id="99" w:name="h-internal-references"/>
-      <w:pPr>
-        <w:pStyle w:val="Heading2"/>
-      </w:pPr>
-      <w:r>
-        <w:t>Internal References</w:t>
-      </w:r>
-      <w:bookmarkEnd w:id="99"/>
-    </w:p>
-    <w:p>
-      <w:r>
-        <w:t>The document supports cross-referencing to:</w:t>
-      </w:r>
-    </w:p>
-    <w:p>
-      <w:r>
-        <w:t xml:space="preserve">Sections (e.g., </w:t>
-      </w:r>
-      <w:hyperlink w:anchor="h-lists-and-enumeration">
-        <w:r>
-          <w:rPr>
-            <w:rStyle w:val="Hyperlink"/>
-            <w:color w:val="0563C1"/>
-            <w:u w:val="single"/>
-          </w:rPr>
-          <w:t xml:space="preserve">Section 4.2</w:t>
-        </w:r>
-      </w:hyperlink>
-      <w:r>
-        <w:t xml:space="preserve"> covers list functionality)</w:t>
-      </w:r>
-    </w:p>
-    <w:p>
-      <w:bookmarkStart w:id="100" w:name="h-external-hyperlinks"/>
-      <w:pPr>
-        <w:pStyle w:val="Heading2"/>
-      </w:pPr>
-      <w:r>
-        <w:t>External Hyperlinks</w:t>
-      </w:r>
-      <w:bookmarkEnd w:id="100"/>
-    </w:p>
-    <w:p>
-      <w:r>
-        <w:t xml:space="preserve">External resources can be linked directly: </w:t>
-      </w:r>
-      <w:hyperlink r:id="rId17">
-        <w:r>
-          <w:rPr>
-            <w:rStyle w:val="Hyperlink"/>
-            <w:color w:val="0563C1"/>
-            <w:u w:val="single"/>
-          </w:rPr>
-          <w:t xml:space="preserve">Markdown Specification</w:t>
-        </w:r>
-      </w:hyperlink>
-      <w:r>
-        <w:t xml:space="preserve"> or </w:t>
-      </w:r>
-      <w:hyperlink r:id="rId18">
-        <w:r>
-          <w:rPr>
-            <w:rStyle w:val="Hyperlink"/>
-            <w:color w:val="0563C1"/>
-            <w:u w:val="single"/>
-          </w:rPr>
-          <w:t xml:space="preserve">Microsoft Word Documentation</w:t>
-        </w:r>
-      </w:hyperlink>
-      <w:r>
-        <w:t>.</w:t>
-      </w:r>
-    </w:p>
-    <w:p>
-      <w:bookmarkStart w:id="101" w:name="h-code-examples"/>
-      <w:pPr>
-        <w:pStyle w:val="Heading1"/>
-        <w:pageBreakBefore w:val="1"/>
-      </w:pPr>
-      <w:r>
-        <w:t>Code Examples</w:t>
-      </w:r>
-      <w:bookmarkEnd w:id="101"/>
-    </w:p>
-    <w:p>
-      <w:bookmarkStart w:id="102" w:name="h-python-code-block"/>
-      <w:pPr>
-        <w:pStyle w:val="Heading2"/>
-      </w:pPr>
-      <w:r>
-        <w:t>Python Code Block</w:t>
-      </w:r>
-      <w:bookmarkEnd w:id="102"/>
-    </w:p>
-    <w:p>
-      <w:pPr>
-        <w:pStyle w:val="Code"/>
-      </w:pPr>
-      <w:r>
-        <w:rPr>
-          <w:rFonts w:ascii="Courier New" w:hAnsi="Courier New"/>
-          <w:sz w:val="18"/>
-        </w:rPr>
-        <w:t>def process_markdown(source_file, config):</w:t>
-        <w:br/>
-        <w:t xml:space="preserve">    """</w:t>
-        <w:br/>
-        <w:t xml:space="preserve">    Main entry point for markdown processing.</w:t>
-        <w:br/>
-        <w:t xml:space="preserve">    </w:t>
-        <w:br/>
-        <w:t xml:space="preserve">    Args:</w:t>
-        <w:br/>
-        <w:t xml:space="preserve">        source_file: Path to markdown input</w:t>
-        <w:br/>
-        <w:t xml:space="preserve">        config: Dictionary of configuration options</w:t>
-        <w:br/>
-        <w:t xml:space="preserve">        </w:t>
-        <w:br/>
-        <w:t xml:space="preserve">    Returns:</w:t>
-        <w:br/>
-        <w:t xml:space="preserve">        Document: Generated Word document object</w:t>
-        <w:br/>
-        <w:t xml:space="preserve">    """</w:t>
-        <w:br/>
-        <w:t xml:space="preserve">    builder = DocumentBuilder(config)</w:t>
-        <w:br/>
-        <w:t xml:space="preserve">    builder.setup()</w:t>
-        <w:br/>
-        <w:t xml:space="preserve">    </w:t>
-        <w:br/>
-        <w:t xml:space="preserve">    with open(source_file, 'r') as f:</w:t>
-        <w:br/>
-        <w:t xml:space="preserve">        content = f.read()</w:t>
-        <w:br/>
-        <w:t xml:space="preserve">    </w:t>
-        <w:br/>
-        <w:t xml:space="preserve">    builder.add_content(content)</w:t>
-        <w:br/>
-        <w:t xml:space="preserve">    return builder.doc</w:t>
-      </w:r>
-    </w:p>
-    <w:p>
-      <w:r>
-        <w:rPr>
-          <w:b w:val="0"/>
-          <w:i/>
-        </w:rPr>
-        <w:t>Code Block 1: Python implementation of the main processing function.</w:t>
-      </w:r>
-    </w:p>
-    <w:p>
-      <w:bookmarkStart w:id="103" w:name="h-javascript-code-block"/>
-      <w:pPr>
-        <w:pStyle w:val="Heading2"/>
-      </w:pPr>
-      <w:r>
-        <w:t>JavaScript Code Block</w:t>
-      </w:r>
-      <w:bookmarkEnd w:id="103"/>
-    </w:p>
-    <w:p>
-      <w:pPr>
-        <w:pStyle w:val="Code"/>
-      </w:pPr>
-      <w:r>
-        <w:rPr>
-          <w:rFonts w:ascii="Courier New" w:hAnsi="Courier New"/>
-          <w:sz w:val="18"/>
-        </w:rPr>
-        <w:t>// Configuration parser for document settings</w:t>
-        <w:br/>
-        <w:t>function parseConfig(configPath) {</w:t>
-        <w:br/>
-        <w:t xml:space="preserve">  const fs = require('fs');</w:t>
-        <w:br/>
-        <w:t xml:space="preserve">  const yaml = require('js-yaml');</w:t>
-        <w:br/>
-        <w:t xml:space="preserve">  </w:t>
-        <w:br/>
-        <w:t xml:space="preserve">  try {</w:t>
-        <w:br/>
-        <w:t xml:space="preserve">    const config = yaml.load(fs.readFileSync(configPath, 'utf8'));</w:t>
-        <w:br/>
-        <w:t xml:space="preserve">    return {</w:t>
-        <w:br/>
-        <w:t xml:space="preserve">      margins: config.page || {},</w:t>
-        <w:br/>
-        <w:t xml:space="preserve">      header: config.header || {},</w:t>
-        <w:br/>
-        <w:t xml:space="preserve">      footer: config.footer || {},</w:t>
-        <w:br/>
-        <w:t xml:space="preserve">      document: config.document || {}</w:t>
-        <w:br/>
-        <w:t xml:space="preserve">    };</w:t>
-        <w:br/>
-        <w:t xml:space="preserve">  } catch (error) {</w:t>
-        <w:br/>
-        <w:t xml:space="preserve">    console.error('Configuration error:', error);</w:t>
-        <w:br/>
-        <w:t xml:space="preserve">    return {};</w:t>
-        <w:br/>
-        <w:t xml:space="preserve">  }</w:t>
-        <w:br/>
-        <w:t>}</w:t>
-      </w:r>
-    </w:p>
-    <w:p>
-      <w:r>
-        <w:rPr>
-          <w:b w:val="0"/>
-          <w:i/>
-        </w:rPr>
-        <w:t>Code Block 2: JavaScript configuration parser implementation.</w:t>
-      </w:r>
-    </w:p>
-    <w:p>
-      <w:bookmarkStart w:id="104" w:name="h-special-elements"/>
-      <w:pPr>
-        <w:pStyle w:val="Heading1"/>
-        <w:pageBreakBefore w:val="1"/>
-      </w:pPr>
-      <w:r>
-        <w:t>Special Elements</w:t>
-      </w:r>
-      <w:bookmarkEnd w:id="104"/>
-    </w:p>
-    <w:p>
-      <w:bookmarkStart w:id="105" w:name="h-alert-boxes"/>
-      <w:pPr>
-        <w:pStyle w:val="Heading2"/>
-      </w:pPr>
-      <w:r>
-        <w:t>Alert Boxes</w:t>
-      </w:r>
-      <w:bookmarkEnd w:id="105"/>
-    </w:p>
-    <w:p>
-      <w:r>
-        <w:t>GitHub-style alerts provide visual emphasis for different message types:</w:t>
-      </w:r>
-    </w:p>
-    <w:tbl>
-      <w:tblPr>
-        <w:tblW w:type="auto" w:w="0"/>
-        <w:tblLayout w:type="fixed"/>
-        <w:tblLook w:firstColumn="1" w:firstRow="1" w:lastColumn="0" w:lastRow="0" w:noHBand="0" w:noVBand="1" w:val="04A0"/>
-        <w:tblInd w:w="216" w:type="dxa"/>
-      </w:tblPr>
-      <w:tblGrid>
-        <w:gridCol w:w="9360"/>
-      </w:tblGrid>
-      <w:tr>
-        <w:tc>
-          <w:tcPr>
-            <w:tcW w:type="dxa" w:w="8597"/>
-            <w:tcMar>
-              <w:top w:w="100" w:type="dxa"/>
-              <w:left w:w="100" w:type="dxa"/>
-              <w:bottom w:w="100" w:type="dxa"/>
-              <w:right w:w="100" w:type="dxa"/>
-            </w:tcMar>
-            <w:tcBorders>
-              <w:left w:val="single" w:sz="24" w:color="2E75B6"/>
-              <w:top w:val="nil"/>
-              <w:right w:val="nil"/>
-              <w:bottom w:val="nil"/>
-            </w:tcBorders>
-            <w:shd w:val="clear" w:color="auto" w:fill="F5F5F5"/>
-          </w:tcPr>
-          <w:p>
-            <w:pPr>
-              <w:spacing w:before="120" w:after="120"/>
-            </w:pPr>
-            <w:r>
-              <w:rPr>
-                <w:b/>
-                <w:color w:val="2E75B6"/>
-              </w:rPr>
-              <w:t xml:space="preserve">[NOTE] </w:t>
-            </w:r>
-            <w:r>
-              <w:t>This is an informational note. It provides additional context or helpful information that supplements the main content.</w:t>
-            </w:r>
-          </w:p>
-        </w:tc>
-      </w:tr>
-    </w:tbl>
-    <w:p>
-      <w:pPr>
-        <w:spacing w:before="0" w:after="160"/>
-      </w:pPr>
-    </w:p>
-    <w:p>
-      <w:pPr>
-        <w:spacing w:before="0" w:after="160" w:line="2" w:lineRule="exact"/>
-      </w:pPr>
-    </w:p>
-    <w:tbl>
-      <w:tblPr>
-        <w:tblW w:type="auto" w:w="0"/>
-        <w:tblLayout w:type="fixed"/>
-        <w:tblLook w:firstColumn="1" w:firstRow="1" w:lastColumn="0" w:lastRow="0" w:noHBand="0" w:noVBand="1" w:val="04A0"/>
-        <w:tblInd w:w="216" w:type="dxa"/>
-      </w:tblPr>
-      <w:tblGrid>
-        <w:gridCol w:w="9360"/>
-      </w:tblGrid>
-      <w:tr>
-        <w:tc>
-          <w:tcPr>
-            <w:tcW w:type="dxa" w:w="8597"/>
-            <w:tcMar>
-              <w:top w:w="100" w:type="dxa"/>
-              <w:left w:w="100" w:type="dxa"/>
-              <w:bottom w:w="100" w:type="dxa"/>
-              <w:right w:w="100" w:type="dxa"/>
-            </w:tcMar>
-            <w:tcBorders>
-              <w:left w:val="single" w:sz="24" w:color="28A745"/>
-              <w:top w:val="nil"/>
-              <w:right w:val="nil"/>
-              <w:bottom w:val="nil"/>
-            </w:tcBorders>
-            <w:shd w:val="clear" w:color="auto" w:fill="F5F5F5"/>
-          </w:tcPr>
-          <w:p>
-            <w:pPr>
-              <w:spacing w:before="120" w:after="120"/>
-            </w:pPr>
-            <w:r>
-              <w:rPr>
-                <w:b/>
-                <w:color w:val="28A745"/>
-              </w:rPr>
-              <w:t xml:space="preserve">[TIP] </w:t>
-            </w:r>
-            <w:r>
-              <w:t>This is a helpful tip. Tips offer practical advice or shortcuts that can improve workflow efficiency.</w:t>
-            </w:r>
-          </w:p>
-        </w:tc>
-      </w:tr>
-    </w:tbl>
-    <w:p>
-      <w:pPr>
-        <w:spacing w:before="0" w:after="160"/>
-      </w:pPr>
-    </w:p>
-    <w:p>
-      <w:pPr>
-        <w:spacing w:before="0" w:after="160" w:line="2" w:lineRule="exact"/>
-      </w:pPr>
-    </w:p>
-    <w:tbl>
-      <w:tblPr>
-        <w:tblW w:type="auto" w:w="0"/>
-        <w:tblLayout w:type="fixed"/>
-        <w:tblLook w:firstColumn="1" w:firstRow="1" w:lastColumn="0" w:lastRow="0" w:noHBand="0" w:noVBand="1" w:val="04A0"/>
-        <w:tblInd w:w="216" w:type="dxa"/>
-      </w:tblPr>
-      <w:tblGrid>
-        <w:gridCol w:w="9360"/>
-      </w:tblGrid>
-      <w:tr>
-        <w:tc>
-          <w:tcPr>
-            <w:tcW w:type="dxa" w:w="8597"/>
-            <w:tcMar>
-              <w:top w:w="100" w:type="dxa"/>
-              <w:left w:w="100" w:type="dxa"/>
-              <w:bottom w:w="100" w:type="dxa"/>
-              <w:right w:w="100" w:type="dxa"/>
-            </w:tcMar>
-            <w:tcBorders>
-              <w:left w:val="single" w:sz="24" w:color="FFA500"/>
-              <w:top w:val="nil"/>
-              <w:right w:val="nil"/>
-              <w:bottom w:val="nil"/>
-            </w:tcBorders>
-            <w:shd w:val="clear" w:color="auto" w:fill="F5F5F5"/>
-          </w:tcPr>
-          <w:p>
-            <w:pPr>
-              <w:spacing w:before="120" w:after="120"/>
-            </w:pPr>
-            <w:r>
-              <w:rPr>
-                <w:b/>
-                <w:color w:val="FFA500"/>
-              </w:rPr>
-              <w:t xml:space="preserve">[WARNING] </w:t>
-            </w:r>
-            <w:r>
-              <w:t>This is a warning message. Warnings indicate potential issues or important considerations that require attention.</w:t>
-            </w:r>
-          </w:p>
-        </w:tc>
-      </w:tr>
-    </w:tbl>
-    <w:p>
-      <w:pPr>
-        <w:spacing w:before="0" w:after="160"/>
-      </w:pPr>
-    </w:p>
-    <w:p>
-      <w:pPr>
-        <w:spacing w:before="0" w:after="160" w:line="2" w:lineRule="exact"/>
-      </w:pPr>
-    </w:p>
-    <w:tbl>
-      <w:tblPr>
-        <w:tblW w:type="auto" w:w="0"/>
-        <w:tblLayout w:type="fixed"/>
-        <w:tblLook w:firstColumn="1" w:firstRow="1" w:lastColumn="0" w:lastRow="0" w:noHBand="0" w:noVBand="1" w:val="04A0"/>
-        <w:tblInd w:w="216" w:type="dxa"/>
-      </w:tblPr>
-      <w:tblGrid>
-        <w:gridCol w:w="9360"/>
-      </w:tblGrid>
-      <w:tr>
-        <w:tc>
-          <w:tcPr>
-            <w:tcW w:type="dxa" w:w="8597"/>
-            <w:tcMar>
-              <w:top w:w="100" w:type="dxa"/>
-              <w:left w:w="100" w:type="dxa"/>
-              <w:bottom w:w="100" w:type="dxa"/>
-              <w:right w:w="100" w:type="dxa"/>
-            </w:tcMar>
-            <w:tcBorders>
-              <w:left w:val="single" w:sz="24" w:color="DC3545"/>
-              <w:top w:val="nil"/>
-              <w:right w:val="nil"/>
-              <w:bottom w:val="nil"/>
-            </w:tcBorders>
-            <w:shd w:val="clear" w:color="auto" w:fill="F5F5F5"/>
-          </w:tcPr>
-          <w:p>
-            <w:pPr>
-              <w:spacing w:before="120" w:after="120"/>
-            </w:pPr>
-            <w:r>
-              <w:rPr>
-                <w:b/>
-                <w:color w:val="DC3545"/>
-              </w:rPr>
-              <w:t xml:space="preserve">[CAUTION] </w:t>
-            </w:r>
-            <w:r>
-              <w:t>This is a caution alert. Cautions highlight actions that could cause problems if not handled carefully.</w:t>
-            </w:r>
-          </w:p>
-        </w:tc>
-      </w:tr>
-    </w:tbl>
-    <w:p>
-      <w:pPr>
-        <w:spacing w:before="0" w:after="160"/>
-      </w:pPr>
-    </w:p>
-    <w:p>
-      <w:pPr>
-        <w:spacing w:before="0" w:after="160" w:line="2" w:lineRule="exact"/>
-      </w:pPr>
-    </w:p>
-    <w:p>
-      <w:bookmarkStart w:id="106" w:name="h-horizontal-rules"/>
-      <w:pPr>
-        <w:pStyle w:val="Heading2"/>
-      </w:pPr>
-      <w:r>
-        <w:t>Horizontal Rules</w:t>
-      </w:r>
-      <w:bookmarkEnd w:id="106"/>
-    </w:p>
-    <w:p>
-      <w:r>
-        <w:t>Horizontal rules can be used to separate sections visually:</w:t>
-      </w:r>
-    </w:p>
-    <w:p>
-      <w:pPr>
-        <w:pageBreakBefore w:val="1"/>
-      </w:pPr>
-      <w:r>
-        <w:t>They create a clear break without starting a new page.</w:t>
-      </w:r>
-    </w:p>
-    <w:p>
-      <w:bookmarkStart w:id="107" w:name="h-vertical-space"/>
-      <w:pPr>
-        <w:pStyle w:val="Heading2"/>
-        <w:pageBreakBefore w:val="1"/>
-      </w:pPr>
-      <w:r>
-        <w:t>Vertical Space</w:t>
-      </w:r>
-      <w:bookmarkEnd w:id="107"/>
-    </w:p>
-    <w:p>
-      <w:r>
-        <w:t xml:space="preserve">The </w:t>
-      </w:r>
-      <w:r>
-        <w:rPr>
-          <w:rFonts w:ascii="Courier New" w:hAnsi="Courier New"/>
-          <w:sz w:val="20"/>
-        </w:rPr>
-        <w:t>:::space</w:t>
-      </w:r>
-      <w:r>
-        <w:t xml:space="preserve"> directive provides precise vertical spacing control, ideal for fine-tuning layout on cover pages and between sections.</w:t>
-      </w:r>
-    </w:p>
-    <w:p>
-      <w:r>
-        <w:t xml:space="preserve">Use </w:t>
-      </w:r>
-      <w:r>
-        <w:rPr>
-          <w:rFonts w:ascii="Courier New" w:hAnsi="Courier New"/>
-          <w:sz w:val="20"/>
-        </w:rPr>
-        <w:t>lines</w:t>
-      </w:r>
-      <w:r>
-        <w:t xml:space="preserve"> to insert space measured in body-text lines (11 pt per line):</w:t>
-      </w:r>
-    </w:p>
-    <w:p>
-      <w:pPr>
-        <w:spacing w:before="0" w:after="0" w:line="660" w:lineRule="exact"/>
-      </w:pPr>
-    </w:p>
-    <w:p>
-      <w:r>
-        <w:t xml:space="preserve">Or use </w:t>
-      </w:r>
-      <w:r>
-        <w:rPr>
-          <w:rFonts w:ascii="Courier New" w:hAnsi="Courier New"/>
-          <w:sz w:val="20"/>
-        </w:rPr>
-        <w:t>pt</w:t>
-      </w:r>
-      <w:r>
-        <w:t xml:space="preserve"> for an exact point value:</w:t>
-      </w:r>
-    </w:p>
-    <w:p>
-      <w:pPr>
-        <w:spacing w:before="0" w:after="0" w:line="480" w:lineRule="exact"/>
-      </w:pPr>
-    </w:p>
-    <w:p>
-      <w:r>
-        <w:t>Both examples above create white space without forcing a page break.</w:t>
-      </w:r>
-    </w:p>
-    <w:p>
-      <w:bookmarkStart w:id="108" w:name="h-appendix"/>
-      <w:pPr>
-        <w:numPr>
-          <w:ilvl w:val="0"/>
-          <w:numId w:val="0"/>
-        </w:numPr>
-        <w:pStyle w:val="Heading1"/>
-        <w:pageBreakBefore w:val="1"/>
-      </w:pPr>
-      <w:r>
-        <w:t>Appendix</w:t>
-      </w:r>
-      <w:bookmarkEnd w:id="108"/>
-    </w:p>
-    <w:p>
-      <w:bookmarkStart w:id="109" w:name="h-a-supported-markdown-extensions"/>
-      <w:pPr>
-        <w:numPr>
-          <w:ilvl w:val="0"/>
-          <w:numId w:val="0"/>
-        </w:numPr>
-        <w:pStyle w:val="Heading2"/>
-      </w:pPr>
-      <w:r>
-        <w:t>A. Supported Markdown Extensions</w:t>
-      </w:r>
-      <w:bookmarkEnd w:id="109"/>
-    </w:p>
-    <w:p>
-      <w:bookmarkStart w:id="110" w:name="h-a1-github-flavored-markdown"/>
-      <w:pPr>
-        <w:numPr>
-          <w:ilvl w:val="0"/>
-          <w:numId w:val="0"/>
-        </w:numPr>
-        <w:pStyle w:val="Heading3"/>
-      </w:pPr>
-      <w:r>
-        <w:t>A.1 GitHub Flavored Markdown</w:t>
-      </w:r>
-      <w:bookmarkEnd w:id="110"/>
-    </w:p>
-    <w:p>
-      <w:r>
-        <w:t>The converter fully supports GFM syntax including:</w:t>
-      </w:r>
-    </w:p>
-    <w:p>
-      <w:pPr>
-        <w:numPr>
-          <w:ilvl w:val="0"/>
-          <w:numId w:val="25"/>
-        </w:numPr>
-        <w:pStyle w:val="ListBullet"/>
-      </w:pPr>
-      <w:r>
-        <w:t>Tables with alignment</w:t>
-      </w:r>
-    </w:p>
-    <w:p>
-      <w:pPr>
-        <w:numPr>
-          <w:ilvl w:val="0"/>
-          <w:numId w:val="25"/>
-        </w:numPr>
-        <w:pStyle w:val="ListBullet"/>
-      </w:pPr>
-      <w:r>
-        <w:t>Task lists (converted to bullet points)</w:t>
-      </w:r>
-    </w:p>
-    <w:p>
-      <w:pPr>
-        <w:numPr>
-          <w:ilvl w:val="0"/>
-          <w:numId w:val="25"/>
-        </w:numPr>
-        <w:pStyle w:val="ListBullet"/>
-      </w:pPr>
-      <w:r>
-        <w:t>Strikethrough text</w:t>
-      </w:r>
-    </w:p>
-    <w:p>
-      <w:pPr>
-        <w:numPr>
-          <w:ilvl w:val="0"/>
-          <w:numId w:val="25"/>
-        </w:numPr>
-        <w:pStyle w:val="ListBullet"/>
-      </w:pPr>
-      <w:r>
-        <w:t>Autolinks</w:t>
-      </w:r>
-    </w:p>
-    <w:p>
-      <w:bookmarkStart w:id="111" w:name="h-a11-table-alignment"/>
-      <w:pPr>
-        <w:pStyle w:val="Heading3"/>
-      </w:pPr>
-      <w:r>
-        <w:t>A.1.1 Table Alignment</w:t>
-      </w:r>
-      <w:bookmarkEnd w:id="111"/>
-    </w:p>
-    <w:p>
-      <w:r>
-        <w:t>Tables support column alignment through colon placement:</w:t>
-      </w:r>
-    </w:p>
-    <w:tbl>
-      <w:tblPr>
-        <w:tblStyle w:val="MdToDocxDataTable"/>
-        <w:tblLook w:firstColumn="0" w:firstRow="1" w:lastColumn="0" w:lastRow="0" w:noHBand="0" w:noVBand="1" w:val="0420"/>
-        <w:tblW w:w="5000" w:type="pct"/>
-      </w:tblPr>
-      <w:tblGrid>
-        <w:gridCol w:w="3120"/>
-        <w:gridCol w:w="3120"/>
-        <w:gridCol w:w="3120"/>
-      </w:tblGrid>
-      <w:tr>
-        <w:trPr>
-          <w:cantSplit w:val="1"/>
-        </w:trPr>
-        <w:tc>
-          <w:tcPr>
-            <w:tcW w:type="dxa" w:w="3120"/>
-          </w:tcPr>
-          <w:p>
-            <w:r>
-              <w:t>Left</w:t>
-            </w:r>
-          </w:p>
-        </w:tc>
-        <w:tc>
-          <w:tcPr>
-            <w:tcW w:type="dxa" w:w="3120"/>
-          </w:tcPr>
-          <w:p>
-            <w:r>
-              <w:t>Center</w:t>
-            </w:r>
-          </w:p>
-        </w:tc>
-        <w:tc>
-          <w:tcPr>
-            <w:tcW w:type="dxa" w:w="3120"/>
-          </w:tcPr>
-          <w:p>
-            <w:r>
-              <w:t>Right</w:t>
-            </w:r>
-          </w:p>
-        </w:tc>
-      </w:tr>
-      <w:tr>
-        <w:trPr>
-          <w:cantSplit w:val="1"/>
-        </w:trPr>
-        <w:tc>
-          <w:tcPr>
-            <w:tcW w:type="dxa" w:w="3120"/>
-          </w:tcPr>
-          <w:p>
-            <w:r>
-              <w:t>L1</w:t>
-            </w:r>
-          </w:p>
-        </w:tc>
-        <w:tc>
-          <w:tcPr>
-            <w:tcW w:type="dxa" w:w="3120"/>
-          </w:tcPr>
-          <w:p>
-            <w:r>
-              <w:t>C1</w:t>
-            </w:r>
-          </w:p>
-        </w:tc>
-        <w:tc>
-          <w:tcPr>
-            <w:tcW w:type="dxa" w:w="3120"/>
-          </w:tcPr>
-          <w:p>
-            <w:r>
-              <w:t>R1</w:t>
-            </w:r>
-          </w:p>
-        </w:tc>
-      </w:tr>
-      <w:tr>
-        <w:trPr>
-          <w:cantSplit w:val="1"/>
-        </w:trPr>
-        <w:tc>
-          <w:tcPr>
-            <w:tcW w:type="dxa" w:w="3120"/>
-          </w:tcPr>
-          <w:p>
-            <w:r>
-              <w:t>L2</w:t>
-            </w:r>
-          </w:p>
-        </w:tc>
-        <w:tc>
-          <w:tcPr>
-            <w:tcW w:type="dxa" w:w="3120"/>
-          </w:tcPr>
-          <w:p>
-            <w:r>
-              <w:t>C2</w:t>
-            </w:r>
-          </w:p>
-        </w:tc>
-        <w:tc>
-          <w:tcPr>
-            <w:tcW w:type="dxa" w:w="3120"/>
-          </w:tcPr>
-          <w:p>
-            <w:r>
-              <w:t>R2</w:t>
-            </w:r>
-          </w:p>
-        </w:tc>
-      </w:tr>
-    </w:tbl>
-    <w:p>
-      <w:bookmarkStart w:id="112" w:name="h-a2-custom-extensions"/>
-      <w:pPr>
-        <w:pStyle w:val="Heading3"/>
-      </w:pPr>
-      <w:r>
-        <w:t>A.2 Custom Extensions</w:t>
-      </w:r>
-      <w:bookmarkEnd w:id="112"/>
-    </w:p>
-    <w:p>
-      <w:r>
-        <w:t>Additional features beyond standard Markdown:</w:t>
-      </w:r>
-    </w:p>
-    <w:p>
-      <w:pPr>
-        <w:numPr>
-          <w:ilvl w:val="0"/>
-          <w:numId w:val="26"/>
-        </w:numPr>
-        <w:pStyle w:val="ListBullet"/>
-      </w:pPr>
-      <w:r>
-        <w:t xml:space="preserve">Image sizing with </w:t>
-      </w:r>
-      <w:r>
-        <w:rPr>
-          <w:rFonts w:ascii="Courier New" w:hAnsi="Courier New"/>
-          <w:sz w:val="20"/>
-        </w:rPr>
-        <w:t>{.xs}</w:t>
-      </w:r>
-      <w:r>
-        <w:t xml:space="preserve">, </w:t>
-      </w:r>
-      <w:r>
-        <w:rPr>
-          <w:rFonts w:ascii="Courier New" w:hAnsi="Courier New"/>
-          <w:sz w:val="20"/>
-        </w:rPr>
-        <w:t>{.small}</w:t>
-      </w:r>
-      <w:r>
-        <w:t xml:space="preserve">, </w:t>
-      </w:r>
-      <w:r>
-        <w:rPr>
-          <w:rFonts w:ascii="Courier New" w:hAnsi="Courier New"/>
-          <w:sz w:val="20"/>
-        </w:rPr>
-        <w:t>{.medium}</w:t>
-      </w:r>
-      <w:r>
-        <w:t xml:space="preserve">, </w:t>
-      </w:r>
-      <w:r>
-        <w:rPr>
-          <w:rFonts w:ascii="Courier New" w:hAnsi="Courier New"/>
-          <w:sz w:val="20"/>
-        </w:rPr>
-        <w:t>{.large}</w:t>
-      </w:r>
-      <w:r>
-        <w:t xml:space="preserve">, </w:t>
-      </w:r>
-      <w:r>
-        <w:rPr>
-          <w:rFonts w:ascii="Courier New" w:hAnsi="Courier New"/>
-          <w:sz w:val="20"/>
-        </w:rPr>
-        <w:t>{.xl}</w:t>
-      </w:r>
-    </w:p>
-    <w:p>
-      <w:pPr>
-        <w:numPr>
-          <w:ilvl w:val="0"/>
-          <w:numId w:val="26"/>
-        </w:numPr>
-        <w:pStyle w:val="ListBullet"/>
-      </w:pPr>
-      <w:r>
-        <w:t xml:space="preserve">Alignment classes: </w:t>
-      </w:r>
-      <w:r>
-        <w:rPr>
-          <w:rFonts w:ascii="Courier New" w:hAnsi="Courier New"/>
-          <w:sz w:val="20"/>
-        </w:rPr>
-        <w:t>{.left}</w:t>
-      </w:r>
-      <w:r>
-        <w:t xml:space="preserve">, </w:t>
-      </w:r>
-      <w:r>
-        <w:rPr>
-          <w:rFonts w:ascii="Courier New" w:hAnsi="Courier New"/>
-          <w:sz w:val="20"/>
-        </w:rPr>
-        <w:t>{.center}</w:t>
-      </w:r>
-      <w:r>
-        <w:t xml:space="preserve">, </w:t>
-      </w:r>
-      <w:r>
-        <w:rPr>
-          <w:rFonts w:ascii="Courier New" w:hAnsi="Courier New"/>
-          <w:sz w:val="20"/>
-        </w:rPr>
-        <w:t>{.right}</w:t>
-      </w:r>
-    </w:p>
-    <w:p>
-      <w:pPr>
-        <w:numPr>
-          <w:ilvl w:val="0"/>
-          <w:numId w:val="26"/>
-        </w:numPr>
-        <w:pStyle w:val="ListBullet"/>
-      </w:pPr>
-      <w:r>
-        <w:t xml:space="preserve">Heading attributes: </w:t>
-      </w:r>
-      <w:r>
-        <w:rPr>
-          <w:rFonts w:ascii="Courier New" w:hAnsi="Courier New"/>
-          <w:sz w:val="20"/>
-        </w:rPr>
-        <w:t>{.notoc}</w:t>
-      </w:r>
-      <w:r>
-        <w:t xml:space="preserve">, </w:t>
-      </w:r>
-      <w:r>
-        <w:rPr>
-          <w:rFonts w:ascii="Courier New" w:hAnsi="Courier New"/>
-          <w:sz w:val="20"/>
-        </w:rPr>
-        <w:t>{.nonumber}</w:t>
-      </w:r>
-    </w:p>
-    <w:p>
-      <w:pPr>
-        <w:numPr>
-          <w:ilvl w:val="0"/>
-          <w:numId w:val="26"/>
-        </w:numPr>
-        <w:pStyle w:val="ListBullet"/>
-      </w:pPr>
-      <w:r>
-        <w:t xml:space="preserve">Figure groups with </w:t>
-      </w:r>
-      <w:r>
-        <w:rPr>
-          <w:rFonts w:ascii="Courier New" w:hAnsi="Courier New"/>
-          <w:sz w:val="20"/>
-        </w:rPr>
-        <w:t>:::figures</w:t>
-      </w:r>
-      <w:r>
-        <w:t xml:space="preserve"> blocks</w:t>
-      </w:r>
-    </w:p>
-    <w:p>
-      <w:pPr>
-        <w:numPr>
-          <w:ilvl w:val="0"/>
-          <w:numId w:val="26"/>
-        </w:numPr>
-        <w:pStyle w:val="ListBullet"/>
-      </w:pPr>
-      <w:r>
-        <w:t xml:space="preserve">Custom column widths: </w:t>
-      </w:r>
-      <w:r>
-        <w:rPr>
-          <w:rFonts w:ascii="Courier New" w:hAnsi="Courier New"/>
-          <w:sz w:val="20"/>
-        </w:rPr>
-        <w:t>{col-widths="20%,30%,50%"}</w:t>
-      </w:r>
-    </w:p>
-    <w:p>
-      <w:bookmarkStart w:id="113" w:name="h-b-configuration-options"/>
-      <w:pPr>
-        <w:numPr>
-          <w:ilvl w:val="0"/>
-          <w:numId w:val="0"/>
-        </w:numPr>
-        <w:pStyle w:val="Heading2"/>
-      </w:pPr>
-      <w:r>
-        <w:t>B. Configuration Options</w:t>
-      </w:r>
-      <w:bookmarkEnd w:id="113"/>
-    </w:p>
-    <w:p>
-      <w:bookmarkStart w:id="114" w:name="h-b1-document-metadata"/>
-      <w:pPr>
-        <w:numPr>
-          <w:ilvl w:val="0"/>
-          <w:numId w:val="0"/>
-        </w:numPr>
-        <w:pStyle w:val="Heading3"/>
-      </w:pPr>
-      <w:r>
-        <w:t>B.1 Document Metadata</w:t>
-      </w:r>
-      <w:bookmarkEnd w:id="114"/>
-    </w:p>
-    <w:p>
-      <w:r>
-        <w:t xml:space="preserve">Controlled via </w:t>
-      </w:r>
-      <w:r>
-        <w:rPr>
-          <w:rFonts w:ascii="Courier New" w:hAnsi="Courier New"/>
-          <w:sz w:val="20"/>
-        </w:rPr>
-        <w:t>config.yaml</w:t>
-      </w:r>
-      <w:r>
-        <w:t>:</w:t>
-      </w:r>
-    </w:p>
-    <w:p>
-      <w:pPr>
-        <w:numPr>
-          <w:ilvl w:val="0"/>
-          <w:numId w:val="27"/>
-        </w:numPr>
-        <w:pStyle w:val="ListNumber"/>
-      </w:pPr>
-      <w:r>
-        <w:rPr>
-          <w:b/>
-        </w:rPr>
-        <w:t>Document properties</w:t>
-      </w:r>
-      <w:r>
-        <w:t>: title, author, date, version</w:t>
-      </w:r>
-    </w:p>
-    <w:p>
-      <w:pPr>
-        <w:numPr>
-          <w:ilvl w:val="0"/>
-          <w:numId w:val="27"/>
-        </w:numPr>
-        <w:pStyle w:val="ListNumber"/>
-      </w:pPr>
-      <w:r>
-        <w:rPr>
-          <w:b/>
-        </w:rPr>
-        <w:t>Page layout</w:t>
-      </w:r>
-      <w:r>
-        <w:t>: margins, paper size, orientation</w:t>
-      </w:r>
-    </w:p>
-    <w:p>
-      <w:pPr>
-        <w:numPr>
-          <w:ilvl w:val="0"/>
-          <w:numId w:val="27"/>
-        </w:numPr>
-        <w:pStyle w:val="ListNumber"/>
-      </w:pPr>
-      <w:r>
-        <w:rPr>
-          <w:b/>
-        </w:rPr>
-        <w:t>Headers and footers</w:t>
-      </w:r>
-      <w:r>
-        <w:t>: content, alignment, dynamic fields</w:t>
-      </w:r>
-    </w:p>
-    <w:p>
-      <w:bookmarkStart w:id="115" w:name="h-b11-dynamic-fields"/>
-      <w:pPr>
-        <w:numPr>
-          <w:ilvl w:val="0"/>
-          <w:numId w:val="0"/>
-        </w:numPr>
-        <w:pStyle w:val="Heading3"/>
-      </w:pPr>
-      <w:r>
-        <w:t>B.1.1 Dynamic Fields</w:t>
-      </w:r>
-      <w:bookmarkEnd w:id="115"/>
-    </w:p>
-    <w:p>
-      <w:r>
-        <w:t>Headers and footers support placeholder substitution:</w:t>
-      </w:r>
-    </w:p>
-    <w:p>
-      <w:pPr>
-        <w:numPr>
-          <w:ilvl w:val="0"/>
-          <w:numId w:val="28"/>
-        </w:numPr>
-        <w:pStyle w:val="ListBullet"/>
-      </w:pPr>
-      <w:r>
-        <w:rPr>
-          <w:rFonts w:ascii="Courier New" w:hAnsi="Courier New"/>
-          <w:sz w:val="20"/>
-        </w:rPr>
-        <w:t>{title}</w:t>
-      </w:r>
-      <w:r>
-        <w:t xml:space="preserve"> - Document title from config</w:t>
-      </w:r>
-    </w:p>
-    <w:p>
-      <w:pPr>
-        <w:numPr>
-          <w:ilvl w:val="0"/>
-          <w:numId w:val="28"/>
-        </w:numPr>
-        <w:pStyle w:val="ListBullet"/>
-      </w:pPr>
-      <w:r>
-        <w:rPr>
-          <w:rFonts w:ascii="Courier New" w:hAnsi="Courier New"/>
-          <w:sz w:val="20"/>
-        </w:rPr>
-        <w:t>{author}</w:t>
-      </w:r>
-      <w:r>
-        <w:t xml:space="preserve"> - Author name from config</w:t>
-      </w:r>
-    </w:p>
-    <w:p>
-      <w:pPr>
-        <w:numPr>
-          <w:ilvl w:val="0"/>
-          <w:numId w:val="28"/>
-        </w:numPr>
-        <w:pStyle w:val="ListBullet"/>
-      </w:pPr>
-      <w:r>
-        <w:rPr>
-          <w:rFonts w:ascii="Courier New" w:hAnsi="Courier New"/>
-          <w:sz w:val="20"/>
-        </w:rPr>
-        <w:t>{date}</w:t>
-      </w:r>
-      <w:r>
-        <w:t xml:space="preserve"> - Document date from config</w:t>
-      </w:r>
-    </w:p>
-    <w:p>
-      <w:pPr>
-        <w:numPr>
-          <w:ilvl w:val="0"/>
-          <w:numId w:val="28"/>
-        </w:numPr>
-        <w:pStyle w:val="ListBullet"/>
-      </w:pPr>
-      <w:r>
-        <w:rPr>
-          <w:rFonts w:ascii="Courier New" w:hAnsi="Courier New"/>
-          <w:sz w:val="20"/>
-        </w:rPr>
-        <w:t>{page}</w:t>
-      </w:r>
-      <w:r>
-        <w:t xml:space="preserve"> - Current page number</w:t>
-      </w:r>
-    </w:p>
-    <w:p>
-      <w:pPr>
-        <w:numPr>
-          <w:ilvl w:val="0"/>
-          <w:numId w:val="28"/>
-        </w:numPr>
-        <w:pStyle w:val="ListBullet"/>
-      </w:pPr>
-      <w:r>
-        <w:rPr>
-          <w:rFonts w:ascii="Courier New" w:hAnsi="Courier New"/>
-          <w:sz w:val="20"/>
-        </w:rPr>
-        <w:t>{total}</w:t>
-      </w:r>
-      <w:r>
-        <w:t xml:space="preserve"> - Total page count</w:t>
-      </w:r>
-    </w:p>
-    <w:p>
-      <w:bookmarkStart w:id="116" w:name="h-b2-styling-options"/>
-      <w:pPr>
-        <w:numPr>
-          <w:ilvl w:val="0"/>
-          <w:numId w:val="0"/>
-        </w:numPr>
-        <w:pStyle w:val="Heading3"/>
-      </w:pPr>
-      <w:r>
-        <w:t>B.2 Styling Options</w:t>
-      </w:r>
-      <w:bookmarkEnd w:id="116"/>
-    </w:p>
-    <w:p>
-      <w:r>
-        <w:t>Visual presentation controlled through:</w:t>
-      </w:r>
-    </w:p>
-    <w:p>
-      <w:pPr>
-        <w:numPr>
-          <w:ilvl w:val="0"/>
-          <w:numId w:val="29"/>
-        </w:numPr>
-        <w:pStyle w:val="ListBullet"/>
-      </w:pPr>
-      <w:r>
-        <w:rPr>
-          <w:b/>
-        </w:rPr>
-        <w:t>Heading colors</w:t>
-      </w:r>
-      <w:r>
-        <w:t>: Alternating dark blue and medium blue</w:t>
-      </w:r>
-    </w:p>
-    <w:p>
-      <w:pPr>
-        <w:numPr>
-          <w:ilvl w:val="0"/>
-          <w:numId w:val="29"/>
-        </w:numPr>
-        <w:pStyle w:val="ListBullet"/>
-      </w:pPr>
-      <w:r>
-        <w:rPr>
-          <w:b/>
-        </w:rPr>
-        <w:t>Numbered headings</w:t>
-      </w:r>
-      <w:r>
-        <w:t>: Optional sequential numbering</w:t>
-      </w:r>
-    </w:p>
-    <w:p>
-      <w:pPr>
-        <w:numPr>
-          <w:ilvl w:val="0"/>
-          <w:numId w:val="29"/>
-        </w:numPr>
-        <w:pStyle w:val="ListBullet"/>
-      </w:pPr>
-      <w:r>
-        <w:rPr>
-          <w:b/>
-        </w:rPr>
-        <w:t>Code formatting</w:t>
-      </w:r>
-      <w:r>
-        <w:t>: Grey background with monospace font</w:t>
-      </w:r>
-    </w:p>
-    <w:p>
-      <w:pPr>
-        <w:numPr>
-          <w:ilvl w:val="0"/>
-          <w:numId w:val="29"/>
-        </w:numPr>
-        <w:pStyle w:val="ListBullet"/>
-      </w:pPr>
-      <w:r>
-        <w:rPr>
-          <w:b/>
-        </w:rPr>
-        <w:t>Table styling</w:t>
-      </w:r>
-      <w:r>
-        <w:t>: Alternating row shading, header formatting</w:t>
-      </w:r>
-    </w:p>
-    <w:p>
-      <w:bookmarkStart w:id="117" w:name="h-c-property-substitution"/>
-      <w:pPr>
-        <w:numPr>
-          <w:ilvl w:val="0"/>
-          <w:numId w:val="0"/>
-        </w:numPr>
-        <w:pStyle w:val="Heading2"/>
-      </w:pPr>
-      <w:r>
-        <w:t>C. Property Substitution</w:t>
-      </w:r>
-      <w:bookmarkEnd w:id="117"/>
-    </w:p>
-    <w:p>
-      <w:r>
-        <w:t xml:space="preserve">Dynamic values can be inserted using </w:t>
-      </w:r>
-      <w:r>
-        <w:rPr>
-          <w:rFonts w:ascii="Courier New" w:hAnsi="Courier New"/>
-          <w:sz w:val="20"/>
-        </w:rPr>
-        <w:t>{{property}}</w:t>
-      </w:r>
-      <w:r>
-        <w:t xml:space="preserve"> syntax from </w:t>
-      </w:r>
-      <w:r>
-        <w:rPr>
-          <w:rFonts w:ascii="Courier New" w:hAnsi="Courier New"/>
-          <w:sz w:val="20"/>
-        </w:rPr>
-        <w:t>properties.yaml</w:t>
-      </w:r>
-      <w:r>
-        <w:t>. This enables template-based document generation where specific values are populated at build time.</w:t>
-      </w:r>
-    </w:p>
-    <w:p>
-      <w:bookmarkStart w:id="118" w:name="h-c1-usage-examples"/>
-      <w:pPr>
-        <w:numPr>
-          <w:ilvl w:val="0"/>
-          <w:numId w:val="0"/>
-        </w:numPr>
-        <w:pStyle w:val="Heading3"/>
-      </w:pPr>
-      <w:r>
-        <w:t>C.1 Usage Examples</w:t>
-      </w:r>
-      <w:bookmarkEnd w:id="118"/>
-    </w:p>
-    <w:p>
-      <w:r>
-        <w:t xml:space="preserve">The converter supports </w:t>
-      </w:r>
-      <w:r>
-        <w:rPr>
-          <w:b/>
-        </w:rPr>
-        <w:t>6 levels</w:t>
-      </w:r>
-      <w:r>
-        <w:t xml:space="preserve"> heading levels and </w:t>
-      </w:r>
-      <w:r>
-        <w:rPr>
-          <w:b/>
-        </w:rPr>
-        <w:t>3 styles</w:t>
-      </w:r>
-      <w:r>
-        <w:t xml:space="preserve"> table styles. The </w:t>
-      </w:r>
-      <w:r>
-        <w:rPr>
-          <w:b/>
-        </w:rPr>
-        <w:t>md_to_docx</w:t>
-      </w:r>
-      <w:r>
-        <w:t xml:space="preserve"> project is currently at version </w:t>
-      </w:r>
-      <w:r>
-        <w:rPr>
-          <w:b/>
-        </w:rPr>
-        <w:t>2.0</w:t>
-      </w:r>
-      <w:r>
-        <w:t xml:space="preserve"> and has processed over </w:t>
-      </w:r>
-      <w:r>
-        <w:rPr>
-          <w:b/>
-        </w:rPr>
-        <w:t>1,250+</w:t>
-      </w:r>
-      <w:r>
-        <w:t xml:space="preserve"> files.</w:t>
-      </w:r>
-    </w:p>
-    <w:p>
-      <w:bookmarkStart w:id="119" w:name="h-c2-configuration-data"/>
-      <w:pPr>
-        <w:numPr>
-          <w:ilvl w:val="0"/>
-          <w:numId w:val="0"/>
-        </w:numPr>
-        <w:pStyle w:val="Heading3"/>
-      </w:pPr>
-      <w:r>
-        <w:t>C.2 Configuration Data</w:t>
-      </w:r>
-      <w:bookmarkEnd w:id="119"/>
-    </w:p>
-    <w:p>
-      <w:r>
-        <w:t>Based on the configuration:</w:t>
-      </w:r>
-    </w:p>
-    <w:p>
-      <w:pPr>
-        <w:numPr>
-          <w:ilvl w:val="0"/>
-          <w:numId w:val="30"/>
-        </w:numPr>
-        <w:pStyle w:val="ListBullet"/>
-      </w:pPr>
-      <w:r>
-        <w:rPr>
-          <w:b/>
-        </w:rPr>
-        <w:t>Supported formats</w:t>
-      </w:r>
-      <w:r>
-        <w:t>: Markdown to Word (.docx)</w:t>
-      </w:r>
-    </w:p>
-    <w:p>
-      <w:pPr>
-        <w:numPr>
-          <w:ilvl w:val="0"/>
-          <w:numId w:val="30"/>
-        </w:numPr>
-        <w:pStyle w:val="ListBullet"/>
-      </w:pPr>
-      <w:r>
-        <w:rPr>
-          <w:b/>
-        </w:rPr>
-        <w:t>Parser engine</w:t>
-      </w:r>
-      <w:r>
-        <w:t>: Marko with GFM extensions</w:t>
-      </w:r>
-    </w:p>
-    <w:p>
-      <w:pPr>
-        <w:numPr>
-          <w:ilvl w:val="0"/>
-          <w:numId w:val="30"/>
-        </w:numPr>
-        <w:pStyle w:val="ListBullet"/>
-      </w:pPr>
-      <w:r>
-        <w:rPr>
-          <w:b/>
-        </w:rPr>
-        <w:t>Maximum heading depth</w:t>
-      </w:r>
-      <w:r>
-        <w:t>: 6 levels</w:t>
-      </w:r>
-    </w:p>
-    <w:p>
-      <w:pPr>
-        <w:numPr>
-          <w:ilvl w:val="0"/>
-          <w:numId w:val="30"/>
-        </w:numPr>
-        <w:pStyle w:val="ListBullet"/>
-      </w:pPr>
-      <w:r>
-        <w:rPr>
-          <w:b/>
-        </w:rPr>
-        <w:t>Available image sizes</w:t>
-      </w:r>
-      <w:r>
-        <w:t>: 5 classes (xs, small, medium, large, xl)</w:t>
-      </w:r>
-    </w:p>
-    <w:p>
-      <w:pPr>
-        <w:numPr>
-          <w:ilvl w:val="0"/>
-          <w:numId w:val="30"/>
-        </w:numPr>
-        <w:pStyle w:val="ListBullet"/>
-      </w:pPr>
-      <w:r>
-        <w:rPr>
-          <w:b/>
-        </w:rPr>
-        <w:t>Alert types</w:t>
-      </w:r>
-      <w:r>
-        <w:t>: 4 types (note, tip, warning, caution)</w:t>
-      </w:r>
-    </w:p>
-    <w:p>
-      <w:pPr>
-        <w:numPr>
-          <w:ilvl w:val="0"/>
-          <w:numId w:val="30"/>
         </w:numPr>
         <w:pStyle w:val="ListBullet"/>
       </w:pPr>
@@ -8745,216 +4944,6 @@
     </w:lvlOverride>
   </w:num>
   <w:num w:numId="20">
-    <w:abstractNumId w:val="11"/>
-    <w:lvlOverride w:ilvl="0">
-      <w:startOverride w:val="1"/>
-    </w:lvlOverride>
-    <w:lvlOverride w:ilvl="1">
-      <w:startOverride w:val="1"/>
-    </w:lvlOverride>
-    <w:lvlOverride w:ilvl="2">
-      <w:startOverride w:val="1"/>
-    </w:lvlOverride>
-    <w:lvlOverride w:ilvl="3">
-      <w:startOverride w:val="1"/>
-    </w:lvlOverride>
-    <w:lvlOverride w:ilvl="4">
-      <w:startOverride w:val="1"/>
-    </w:lvlOverride>
-    <w:lvlOverride w:ilvl="5">
-      <w:startOverride w:val="1"/>
-    </w:lvlOverride>
-  </w:num>
-  <w:num w:numId="21">
-    <w:abstractNumId w:val="10"/>
-    <w:lvlOverride w:ilvl="0">
-      <w:startOverride w:val="1"/>
-    </w:lvlOverride>
-    <w:lvlOverride w:ilvl="1">
-      <w:startOverride w:val="1"/>
-    </w:lvlOverride>
-    <w:lvlOverride w:ilvl="2">
-      <w:startOverride w:val="1"/>
-    </w:lvlOverride>
-    <w:lvlOverride w:ilvl="3">
-      <w:startOverride w:val="1"/>
-    </w:lvlOverride>
-    <w:lvlOverride w:ilvl="4">
-      <w:startOverride w:val="1"/>
-    </w:lvlOverride>
-    <w:lvlOverride w:ilvl="5">
-      <w:startOverride w:val="1"/>
-    </w:lvlOverride>
-  </w:num>
-  <w:num w:numId="22">
-    <w:abstractNumId w:val="11"/>
-    <w:lvlOverride w:ilvl="0">
-      <w:startOverride w:val="1"/>
-    </w:lvlOverride>
-    <w:lvlOverride w:ilvl="1">
-      <w:startOverride w:val="1"/>
-    </w:lvlOverride>
-    <w:lvlOverride w:ilvl="2">
-      <w:startOverride w:val="1"/>
-    </w:lvlOverride>
-    <w:lvlOverride w:ilvl="3">
-      <w:startOverride w:val="1"/>
-    </w:lvlOverride>
-    <w:lvlOverride w:ilvl="4">
-      <w:startOverride w:val="1"/>
-    </w:lvlOverride>
-    <w:lvlOverride w:ilvl="5">
-      <w:startOverride w:val="1"/>
-    </w:lvlOverride>
-  </w:num>
-  <w:num w:numId="23">
-    <w:abstractNumId w:val="10"/>
-    <w:lvlOverride w:ilvl="0">
-      <w:startOverride w:val="1"/>
-    </w:lvlOverride>
-    <w:lvlOverride w:ilvl="1">
-      <w:startOverride w:val="1"/>
-    </w:lvlOverride>
-    <w:lvlOverride w:ilvl="2">
-      <w:startOverride w:val="1"/>
-    </w:lvlOverride>
-    <w:lvlOverride w:ilvl="3">
-      <w:startOverride w:val="1"/>
-    </w:lvlOverride>
-    <w:lvlOverride w:ilvl="4">
-      <w:startOverride w:val="1"/>
-    </w:lvlOverride>
-    <w:lvlOverride w:ilvl="5">
-      <w:startOverride w:val="1"/>
-    </w:lvlOverride>
-  </w:num>
-  <w:num w:numId="24">
-    <w:abstractNumId w:val="10"/>
-    <w:lvlOverride w:ilvl="0">
-      <w:startOverride w:val="1"/>
-    </w:lvlOverride>
-    <w:lvlOverride w:ilvl="1">
-      <w:startOverride w:val="1"/>
-    </w:lvlOverride>
-    <w:lvlOverride w:ilvl="2">
-      <w:startOverride w:val="1"/>
-    </w:lvlOverride>
-    <w:lvlOverride w:ilvl="3">
-      <w:startOverride w:val="1"/>
-    </w:lvlOverride>
-    <w:lvlOverride w:ilvl="4">
-      <w:startOverride w:val="1"/>
-    </w:lvlOverride>
-    <w:lvlOverride w:ilvl="5">
-      <w:startOverride w:val="1"/>
-    </w:lvlOverride>
-  </w:num>
-  <w:num w:numId="25">
-    <w:abstractNumId w:val="11"/>
-    <w:lvlOverride w:ilvl="0">
-      <w:startOverride w:val="1"/>
-    </w:lvlOverride>
-    <w:lvlOverride w:ilvl="1">
-      <w:startOverride w:val="1"/>
-    </w:lvlOverride>
-    <w:lvlOverride w:ilvl="2">
-      <w:startOverride w:val="1"/>
-    </w:lvlOverride>
-    <w:lvlOverride w:ilvl="3">
-      <w:startOverride w:val="1"/>
-    </w:lvlOverride>
-    <w:lvlOverride w:ilvl="4">
-      <w:startOverride w:val="1"/>
-    </w:lvlOverride>
-    <w:lvlOverride w:ilvl="5">
-      <w:startOverride w:val="1"/>
-    </w:lvlOverride>
-  </w:num>
-  <w:num w:numId="26">
-    <w:abstractNumId w:val="11"/>
-    <w:lvlOverride w:ilvl="0">
-      <w:startOverride w:val="1"/>
-    </w:lvlOverride>
-    <w:lvlOverride w:ilvl="1">
-      <w:startOverride w:val="1"/>
-    </w:lvlOverride>
-    <w:lvlOverride w:ilvl="2">
-      <w:startOverride w:val="1"/>
-    </w:lvlOverride>
-    <w:lvlOverride w:ilvl="3">
-      <w:startOverride w:val="1"/>
-    </w:lvlOverride>
-    <w:lvlOverride w:ilvl="4">
-      <w:startOverride w:val="1"/>
-    </w:lvlOverride>
-    <w:lvlOverride w:ilvl="5">
-      <w:startOverride w:val="1"/>
-    </w:lvlOverride>
-  </w:num>
-  <w:num w:numId="27">
-    <w:abstractNumId w:val="10"/>
-    <w:lvlOverride w:ilvl="0">
-      <w:startOverride w:val="1"/>
-    </w:lvlOverride>
-    <w:lvlOverride w:ilvl="1">
-      <w:startOverride w:val="1"/>
-    </w:lvlOverride>
-    <w:lvlOverride w:ilvl="2">
-      <w:startOverride w:val="1"/>
-    </w:lvlOverride>
-    <w:lvlOverride w:ilvl="3">
-      <w:startOverride w:val="1"/>
-    </w:lvlOverride>
-    <w:lvlOverride w:ilvl="4">
-      <w:startOverride w:val="1"/>
-    </w:lvlOverride>
-    <w:lvlOverride w:ilvl="5">
-      <w:startOverride w:val="1"/>
-    </w:lvlOverride>
-  </w:num>
-  <w:num w:numId="28">
-    <w:abstractNumId w:val="11"/>
-    <w:lvlOverride w:ilvl="0">
-      <w:startOverride w:val="1"/>
-    </w:lvlOverride>
-    <w:lvlOverride w:ilvl="1">
-      <w:startOverride w:val="1"/>
-    </w:lvlOverride>
-    <w:lvlOverride w:ilvl="2">
-      <w:startOverride w:val="1"/>
-    </w:lvlOverride>
-    <w:lvlOverride w:ilvl="3">
-      <w:startOverride w:val="1"/>
-    </w:lvlOverride>
-    <w:lvlOverride w:ilvl="4">
-      <w:startOverride w:val="1"/>
-    </w:lvlOverride>
-    <w:lvlOverride w:ilvl="5">
-      <w:startOverride w:val="1"/>
-    </w:lvlOverride>
-  </w:num>
-  <w:num w:numId="29">
-    <w:abstractNumId w:val="11"/>
-    <w:lvlOverride w:ilvl="0">
-      <w:startOverride w:val="1"/>
-    </w:lvlOverride>
-    <w:lvlOverride w:ilvl="1">
-      <w:startOverride w:val="1"/>
-    </w:lvlOverride>
-    <w:lvlOverride w:ilvl="2">
-      <w:startOverride w:val="1"/>
-    </w:lvlOverride>
-    <w:lvlOverride w:ilvl="3">
-      <w:startOverride w:val="1"/>
-    </w:lvlOverride>
-    <w:lvlOverride w:ilvl="4">
-      <w:startOverride w:val="1"/>
-    </w:lvlOverride>
-    <w:lvlOverride w:ilvl="5">
-      <w:startOverride w:val="1"/>
-    </w:lvlOverride>
-  </w:num>
-  <w:num w:numId="30">
     <w:abstractNumId w:val="11"/>
     <w:lvlOverride w:ilvl="0">
       <w:startOverride w:val="1"/>

</xml_diff>

<commit_message>
Fix list spacing, table alignment, preview auto-build, nested lists, package check
</commit_message>
<xml_diff>
--- a/projects/md-to-docx-showcase/output/document.docx
+++ b/projects/md-to-docx-showcase/output/document.docx
@@ -384,6 +384,7 @@
           <w:numId w:val="11"/>
         </w:numPr>
         <w:pStyle w:val="ListNumber"/>
+        <w:spacing w:before="0" w:after="28" w:line="240" w:lineRule="auto"/>
       </w:pPr>
       <w:r>
         <w:rPr>
@@ -402,6 +403,7 @@
           <w:numId w:val="11"/>
         </w:numPr>
         <w:pStyle w:val="ListNumber"/>
+        <w:spacing w:before="0" w:after="28" w:line="240" w:lineRule="auto"/>
       </w:pPr>
       <w:r>
         <w:rPr>
@@ -420,6 +422,7 @@
           <w:numId w:val="11"/>
         </w:numPr>
         <w:pStyle w:val="ListNumber"/>
+        <w:spacing w:before="0" w:after="28" w:line="240" w:lineRule="auto"/>
       </w:pPr>
       <w:r>
         <w:rPr>
@@ -438,6 +441,7 @@
           <w:numId w:val="11"/>
         </w:numPr>
         <w:pStyle w:val="ListNumber"/>
+        <w:spacing w:before="0" w:after="28" w:line="240" w:lineRule="auto"/>
       </w:pPr>
       <w:r>
         <w:rPr>
@@ -456,6 +460,7 @@
           <w:numId w:val="11"/>
         </w:numPr>
         <w:pStyle w:val="ListNumber"/>
+        <w:spacing w:before="0" w:after="28" w:line="240" w:lineRule="auto"/>
       </w:pPr>
       <w:r>
         <w:rPr>
@@ -474,6 +479,7 @@
           <w:numId w:val="11"/>
         </w:numPr>
         <w:pStyle w:val="ListNumber"/>
+        <w:spacing w:before="0" w:after="28" w:line="240" w:lineRule="auto"/>
       </w:pPr>
       <w:r>
         <w:rPr>
@@ -790,6 +796,7 @@
           <w:numId w:val="12"/>
         </w:numPr>
         <w:pStyle w:val="ListBullet"/>
+        <w:spacing w:before="0" w:after="28" w:line="240" w:lineRule="auto"/>
       </w:pPr>
       <w:r>
         <w:t>First item in the list</w:t>
@@ -802,6 +809,7 @@
           <w:numId w:val="12"/>
         </w:numPr>
         <w:pStyle w:val="ListBullet"/>
+        <w:spacing w:before="0" w:after="28" w:line="240" w:lineRule="auto"/>
       </w:pPr>
       <w:r>
         <w:t>Second item with additional context</w:t>
@@ -814,6 +822,7 @@
           <w:numId w:val="12"/>
         </w:numPr>
         <w:pStyle w:val="ListBullet"/>
+        <w:spacing w:before="0" w:after="28" w:line="240" w:lineRule="auto"/>
       </w:pPr>
       <w:r>
         <w:t>Third item demonstrating the format</w:t>
@@ -841,6 +850,7 @@
           <w:numId w:val="13"/>
         </w:numPr>
         <w:pStyle w:val="ListNumber"/>
+        <w:spacing w:before="0" w:after="28" w:line="240" w:lineRule="auto"/>
       </w:pPr>
       <w:r>
         <w:t>First step in the process</w:t>
@@ -853,6 +863,7 @@
           <w:numId w:val="13"/>
         </w:numPr>
         <w:pStyle w:val="ListNumber"/>
+        <w:spacing w:before="0" w:after="28" w:line="240" w:lineRule="auto"/>
       </w:pPr>
       <w:r>
         <w:t>Second step with specific details</w:t>
@@ -865,6 +876,7 @@
           <w:numId w:val="13"/>
         </w:numPr>
         <w:pStyle w:val="ListNumber"/>
+        <w:spacing w:before="0" w:after="28" w:line="240" w:lineRule="auto"/>
       </w:pPr>
       <w:r>
         <w:t>Third step completing the sequence</w:t>
@@ -892,6 +904,7 @@
           <w:numId w:val="14"/>
         </w:numPr>
         <w:pStyle w:val="ListNumber"/>
+        <w:spacing w:before="0" w:after="28" w:line="240" w:lineRule="auto"/>
       </w:pPr>
       <w:r>
         <w:rPr>
@@ -904,9 +917,10 @@
       <w:pPr>
         <w:numPr>
           <w:ilvl w:val="1"/>
-          <w:numId w:val="14"/>
+          <w:numId w:val="15"/>
         </w:numPr>
         <w:pStyle w:val="ListBullet2"/>
+        <w:spacing w:before="0" w:after="28" w:line="240" w:lineRule="auto"/>
       </w:pPr>
       <w:r>
         <w:t>Sub-item A.1</w:t>
@@ -916,9 +930,10 @@
       <w:pPr>
         <w:numPr>
           <w:ilvl w:val="1"/>
-          <w:numId w:val="14"/>
+          <w:numId w:val="15"/>
         </w:numPr>
         <w:pStyle w:val="ListBullet2"/>
+        <w:spacing w:before="0" w:after="28" w:line="240" w:lineRule="auto"/>
       </w:pPr>
       <w:r>
         <w:t>Sub-item A.2</w:t>
@@ -928,9 +943,10 @@
       <w:pPr>
         <w:numPr>
           <w:ilvl w:val="2"/>
-          <w:numId w:val="14"/>
+          <w:numId w:val="15"/>
         </w:numPr>
         <w:pStyle w:val="ListBullet3"/>
+        <w:spacing w:before="0" w:after="28" w:line="240" w:lineRule="auto"/>
       </w:pPr>
       <w:r>
         <w:t>Detail A.2.1</w:t>
@@ -940,9 +956,10 @@
       <w:pPr>
         <w:numPr>
           <w:ilvl w:val="2"/>
-          <w:numId w:val="14"/>
+          <w:numId w:val="15"/>
         </w:numPr>
         <w:pStyle w:val="ListBullet3"/>
+        <w:spacing w:before="0" w:after="28" w:line="240" w:lineRule="auto"/>
       </w:pPr>
       <w:r>
         <w:t>Detail A.2.2</w:t>
@@ -952,9 +969,10 @@
       <w:pPr>
         <w:numPr>
           <w:ilvl w:val="1"/>
-          <w:numId w:val="14"/>
+          <w:numId w:val="15"/>
         </w:numPr>
         <w:pStyle w:val="ListBullet2"/>
+        <w:spacing w:before="0" w:after="28" w:line="240" w:lineRule="auto"/>
       </w:pPr>
       <w:r>
         <w:t>Sub-item A.3</w:t>
@@ -967,6 +985,7 @@
           <w:numId w:val="14"/>
         </w:numPr>
         <w:pStyle w:val="ListNumber"/>
+        <w:spacing w:before="0" w:after="28" w:line="240" w:lineRule="auto"/>
       </w:pPr>
       <w:r>
         <w:rPr>
@@ -979,9 +998,10 @@
       <w:pPr>
         <w:numPr>
           <w:ilvl w:val="1"/>
-          <w:numId w:val="14"/>
+          <w:numId w:val="16"/>
         </w:numPr>
         <w:pStyle w:val="ListBullet2"/>
+        <w:spacing w:before="0" w:after="28" w:line="240" w:lineRule="auto"/>
       </w:pPr>
       <w:r>
         <w:t>Sub-item B.1</w:t>
@@ -991,9 +1011,10 @@
       <w:pPr>
         <w:numPr>
           <w:ilvl w:val="1"/>
-          <w:numId w:val="14"/>
+          <w:numId w:val="16"/>
         </w:numPr>
         <w:pStyle w:val="ListBullet2"/>
+        <w:spacing w:before="0" w:after="28" w:line="240" w:lineRule="auto"/>
       </w:pPr>
       <w:r>
         <w:t>Sub-item B.2</w:t>
@@ -1006,6 +1027,7 @@
           <w:numId w:val="14"/>
         </w:numPr>
         <w:pStyle w:val="ListNumber"/>
+        <w:spacing w:before="0" w:after="28" w:line="240" w:lineRule="auto"/>
       </w:pPr>
       <w:r>
         <w:rPr>
@@ -1018,9 +1040,10 @@
       <w:pPr>
         <w:numPr>
           <w:ilvl w:val="1"/>
-          <w:numId w:val="14"/>
+          <w:numId w:val="17"/>
         </w:numPr>
         <w:pStyle w:val="ListBullet2"/>
+        <w:spacing w:before="0" w:after="28" w:line="240" w:lineRule="auto"/>
       </w:pPr>
       <w:r>
         <w:t>Sub-item C.1</w:t>
@@ -1072,6 +1095,7 @@
       <w:tr>
         <w:trPr>
           <w:cantSplit w:val="1"/>
+          <w:tblHeader/>
         </w:trPr>
         <w:tc>
           <w:tcPr>
@@ -1595,6 +1619,7 @@
       <w:tr>
         <w:trPr>
           <w:cantSplit w:val="1"/>
+          <w:tblHeader/>
         </w:trPr>
         <w:tc>
           <w:tcPr>
@@ -1886,21 +1911,23 @@
     <w:tbl>
       <w:tblPr>
         <w:tblStyle w:val="MdToDocxDataTable"/>
+        <w:jc w:val="center"/>
         <w:tblLook w:firstColumn="0" w:firstRow="1" w:lastColumn="0" w:lastRow="0" w:noHBand="0" w:noVBand="1" w:val="0420"/>
-        <w:tblW w:w="9360" w:type="dxa"/>
+        <w:tblW w:w="9028" w:type="dxa"/>
       </w:tblPr>
       <w:tblGrid>
-        <w:gridCol w:w="1404"/>
-        <w:gridCol w:w="2340"/>
-        <w:gridCol w:w="5616"/>
+        <w:gridCol w:w="1354"/>
+        <w:gridCol w:w="2257"/>
+        <w:gridCol w:w="5416"/>
       </w:tblGrid>
       <w:tr>
         <w:trPr>
           <w:cantSplit w:val="1"/>
+          <w:tblHeader/>
         </w:trPr>
         <w:tc>
           <w:tcPr>
-            <w:tcW w:w="1404" w:type="dxa"/>
+            <w:tcW w:w="1354" w:type="dxa"/>
           </w:tcPr>
           <w:p>
             <w:r>
@@ -1910,7 +1937,7 @@
         </w:tc>
         <w:tc>
           <w:tcPr>
-            <w:tcW w:w="2340" w:type="dxa"/>
+            <w:tcW w:w="2257" w:type="dxa"/>
           </w:tcPr>
           <w:p>
             <w:r>
@@ -1920,7 +1947,7 @@
         </w:tc>
         <w:tc>
           <w:tcPr>
-            <w:tcW w:w="5616" w:type="dxa"/>
+            <w:tcW w:w="5416" w:type="dxa"/>
           </w:tcPr>
           <w:p>
             <w:r>
@@ -1935,7 +1962,7 @@
         </w:trPr>
         <w:tc>
           <w:tcPr>
-            <w:tcW w:w="1404" w:type="dxa"/>
+            <w:tcW w:w="1354" w:type="dxa"/>
           </w:tcPr>
           <w:p>
             <w:r>
@@ -1945,7 +1972,7 @@
         </w:tc>
         <w:tc>
           <w:tcPr>
-            <w:tcW w:w="2340" w:type="dxa"/>
+            <w:tcW w:w="2257" w:type="dxa"/>
           </w:tcPr>
           <w:p>
             <w:r>
@@ -1955,7 +1982,7 @@
         </w:tc>
         <w:tc>
           <w:tcPr>
-            <w:tcW w:w="5616" w:type="dxa"/>
+            <w:tcW w:w="5416" w:type="dxa"/>
           </w:tcPr>
           <w:p>
             <w:r>
@@ -1970,7 +1997,7 @@
         </w:trPr>
         <w:tc>
           <w:tcPr>
-            <w:tcW w:w="1404" w:type="dxa"/>
+            <w:tcW w:w="1354" w:type="dxa"/>
           </w:tcPr>
           <w:p>
             <w:r>
@@ -1980,7 +2007,7 @@
         </w:tc>
         <w:tc>
           <w:tcPr>
-            <w:tcW w:w="2340" w:type="dxa"/>
+            <w:tcW w:w="2257" w:type="dxa"/>
           </w:tcPr>
           <w:p>
             <w:r>
@@ -1990,7 +2017,7 @@
         </w:tc>
         <w:tc>
           <w:tcPr>
-            <w:tcW w:w="5616" w:type="dxa"/>
+            <w:tcW w:w="5416" w:type="dxa"/>
           </w:tcPr>
           <w:p>
             <w:r>
@@ -2005,7 +2032,7 @@
         </w:trPr>
         <w:tc>
           <w:tcPr>
-            <w:tcW w:w="1404" w:type="dxa"/>
+            <w:tcW w:w="1354" w:type="dxa"/>
           </w:tcPr>
           <w:p>
             <w:r>
@@ -2015,7 +2042,7 @@
         </w:tc>
         <w:tc>
           <w:tcPr>
-            <w:tcW w:w="2340" w:type="dxa"/>
+            <w:tcW w:w="2257" w:type="dxa"/>
           </w:tcPr>
           <w:p>
             <w:r>
@@ -2025,7 +2052,7 @@
         </w:tc>
         <w:tc>
           <w:tcPr>
-            <w:tcW w:w="5616" w:type="dxa"/>
+            <w:tcW w:w="5416" w:type="dxa"/>
           </w:tcPr>
           <w:p>
             <w:r>
@@ -2920,11 +2947,6 @@
     </w:tbl>
     <w:p>
       <w:pPr>
-        <w:spacing w:before="0" w:after="160"/>
-      </w:pPr>
-    </w:p>
-    <w:p>
-      <w:pPr>
         <w:spacing w:before="0" w:after="160" w:line="2" w:lineRule="exact"/>
       </w:pPr>
     </w:p>
@@ -2976,11 +2998,6 @@
     </w:tbl>
     <w:p>
       <w:pPr>
-        <w:spacing w:before="0" w:after="160"/>
-      </w:pPr>
-    </w:p>
-    <w:p>
-      <w:pPr>
         <w:spacing w:before="0" w:after="160" w:line="2" w:lineRule="exact"/>
       </w:pPr>
     </w:p>
@@ -3032,11 +3049,6 @@
     </w:tbl>
     <w:p>
       <w:pPr>
-        <w:spacing w:before="0" w:after="160"/>
-      </w:pPr>
-    </w:p>
-    <w:p>
-      <w:pPr>
         <w:spacing w:before="0" w:after="160" w:line="2" w:lineRule="exact"/>
       </w:pPr>
     </w:p>
@@ -3088,11 +3100,6 @@
     </w:tbl>
     <w:p>
       <w:pPr>
-        <w:spacing w:before="0" w:after="160"/>
-      </w:pPr>
-    </w:p>
-    <w:p>
-      <w:pPr>
         <w:spacing w:before="0" w:after="160" w:line="2" w:lineRule="exact"/>
       </w:pPr>
     </w:p>
@@ -3242,9 +3249,10 @@
       <w:pPr>
         <w:numPr>
           <w:ilvl w:val="0"/>
-          <w:numId w:val="15"/>
+          <w:numId w:val="18"/>
         </w:numPr>
         <w:pStyle w:val="ListBullet"/>
+        <w:spacing w:before="0" w:after="28" w:line="240" w:lineRule="auto"/>
       </w:pPr>
       <w:r>
         <w:t>Tables with alignment</w:t>
@@ -3254,9 +3262,10 @@
       <w:pPr>
         <w:numPr>
           <w:ilvl w:val="0"/>
-          <w:numId w:val="15"/>
+          <w:numId w:val="18"/>
         </w:numPr>
         <w:pStyle w:val="ListBullet"/>
+        <w:spacing w:before="0" w:after="28" w:line="240" w:lineRule="auto"/>
       </w:pPr>
       <w:r>
         <w:t>Task lists (converted to bullet points)</w:t>
@@ -3266,9 +3275,10 @@
       <w:pPr>
         <w:numPr>
           <w:ilvl w:val="0"/>
-          <w:numId w:val="15"/>
+          <w:numId w:val="18"/>
         </w:numPr>
         <w:pStyle w:val="ListBullet"/>
+        <w:spacing w:before="0" w:after="28" w:line="240" w:lineRule="auto"/>
       </w:pPr>
       <w:r>
         <w:t>Strikethrough text</w:t>
@@ -3278,9 +3288,10 @@
       <w:pPr>
         <w:numPr>
           <w:ilvl w:val="0"/>
-          <w:numId w:val="15"/>
+          <w:numId w:val="18"/>
         </w:numPr>
         <w:pStyle w:val="ListBullet"/>
+        <w:spacing w:before="0" w:after="28" w:line="240" w:lineRule="auto"/>
       </w:pPr>
       <w:r>
         <w:t>Autolinks</w:t>
@@ -3315,6 +3326,7 @@
       <w:tr>
         <w:trPr>
           <w:cantSplit w:val="1"/>
+          <w:tblHeader/>
         </w:trPr>
         <w:tc>
           <w:tcPr>
@@ -3437,9 +3449,10 @@
       <w:pPr>
         <w:numPr>
           <w:ilvl w:val="0"/>
-          <w:numId w:val="16"/>
+          <w:numId w:val="19"/>
         </w:numPr>
         <w:pStyle w:val="ListBullet"/>
+        <w:spacing w:before="0" w:after="28" w:line="240" w:lineRule="auto"/>
       </w:pPr>
       <w:r>
         <w:t xml:space="preserve">Image sizing with </w:t>
@@ -3496,9 +3509,10 @@
       <w:pPr>
         <w:numPr>
           <w:ilvl w:val="0"/>
-          <w:numId w:val="16"/>
+          <w:numId w:val="19"/>
         </w:numPr>
         <w:pStyle w:val="ListBullet"/>
+        <w:spacing w:before="0" w:after="28" w:line="240" w:lineRule="auto"/>
       </w:pPr>
       <w:r>
         <w:t xml:space="preserve">Alignment classes: </w:t>
@@ -3535,9 +3549,10 @@
       <w:pPr>
         <w:numPr>
           <w:ilvl w:val="0"/>
-          <w:numId w:val="16"/>
+          <w:numId w:val="19"/>
         </w:numPr>
         <w:pStyle w:val="ListBullet"/>
+        <w:spacing w:before="0" w:after="28" w:line="240" w:lineRule="auto"/>
       </w:pPr>
       <w:r>
         <w:t xml:space="preserve">Heading attributes: </w:t>
@@ -3564,9 +3579,10 @@
       <w:pPr>
         <w:numPr>
           <w:ilvl w:val="0"/>
-          <w:numId w:val="16"/>
+          <w:numId w:val="19"/>
         </w:numPr>
         <w:pStyle w:val="ListBullet"/>
+        <w:spacing w:before="0" w:after="28" w:line="240" w:lineRule="auto"/>
       </w:pPr>
       <w:r>
         <w:t xml:space="preserve">Figure groups with </w:t>
@@ -3586,9 +3602,10 @@
       <w:pPr>
         <w:numPr>
           <w:ilvl w:val="0"/>
-          <w:numId w:val="16"/>
+          <w:numId w:val="19"/>
         </w:numPr>
         <w:pStyle w:val="ListBullet"/>
+        <w:spacing w:before="0" w:after="28" w:line="240" w:lineRule="auto"/>
       </w:pPr>
       <w:r>
         <w:t xml:space="preserve">Custom column widths: </w:t>
@@ -3648,9 +3665,10 @@
       <w:pPr>
         <w:numPr>
           <w:ilvl w:val="0"/>
-          <w:numId w:val="17"/>
+          <w:numId w:val="20"/>
         </w:numPr>
         <w:pStyle w:val="ListNumber"/>
+        <w:spacing w:before="0" w:after="28" w:line="240" w:lineRule="auto"/>
       </w:pPr>
       <w:r>
         <w:rPr>
@@ -3666,9 +3684,10 @@
       <w:pPr>
         <w:numPr>
           <w:ilvl w:val="0"/>
-          <w:numId w:val="17"/>
+          <w:numId w:val="20"/>
         </w:numPr>
         <w:pStyle w:val="ListNumber"/>
+        <w:spacing w:before="0" w:after="28" w:line="240" w:lineRule="auto"/>
       </w:pPr>
       <w:r>
         <w:rPr>
@@ -3684,9 +3703,10 @@
       <w:pPr>
         <w:numPr>
           <w:ilvl w:val="0"/>
-          <w:numId w:val="17"/>
+          <w:numId w:val="20"/>
         </w:numPr>
         <w:pStyle w:val="ListNumber"/>
+        <w:spacing w:before="0" w:after="28" w:line="240" w:lineRule="auto"/>
       </w:pPr>
       <w:r>
         <w:rPr>
@@ -3721,9 +3741,10 @@
       <w:pPr>
         <w:numPr>
           <w:ilvl w:val="0"/>
-          <w:numId w:val="18"/>
+          <w:numId w:val="21"/>
         </w:numPr>
         <w:pStyle w:val="ListBullet"/>
+        <w:spacing w:before="0" w:after="28" w:line="240" w:lineRule="auto"/>
       </w:pPr>
       <w:r>
         <w:rPr>
@@ -3740,9 +3761,10 @@
       <w:pPr>
         <w:numPr>
           <w:ilvl w:val="0"/>
-          <w:numId w:val="18"/>
+          <w:numId w:val="21"/>
         </w:numPr>
         <w:pStyle w:val="ListBullet"/>
+        <w:spacing w:before="0" w:after="28" w:line="240" w:lineRule="auto"/>
       </w:pPr>
       <w:r>
         <w:rPr>
@@ -3759,9 +3781,10 @@
       <w:pPr>
         <w:numPr>
           <w:ilvl w:val="0"/>
-          <w:numId w:val="18"/>
+          <w:numId w:val="21"/>
         </w:numPr>
         <w:pStyle w:val="ListBullet"/>
+        <w:spacing w:before="0" w:after="28" w:line="240" w:lineRule="auto"/>
       </w:pPr>
       <w:r>
         <w:rPr>
@@ -3778,9 +3801,10 @@
       <w:pPr>
         <w:numPr>
           <w:ilvl w:val="0"/>
-          <w:numId w:val="18"/>
+          <w:numId w:val="21"/>
         </w:numPr>
         <w:pStyle w:val="ListBullet"/>
+        <w:spacing w:before="0" w:after="28" w:line="240" w:lineRule="auto"/>
       </w:pPr>
       <w:r>
         <w:rPr>
@@ -3797,9 +3821,10 @@
       <w:pPr>
         <w:numPr>
           <w:ilvl w:val="0"/>
-          <w:numId w:val="18"/>
+          <w:numId w:val="21"/>
         </w:numPr>
         <w:pStyle w:val="ListBullet"/>
+        <w:spacing w:before="0" w:after="28" w:line="240" w:lineRule="auto"/>
       </w:pPr>
       <w:r>
         <w:rPr>
@@ -3835,9 +3860,10 @@
       <w:pPr>
         <w:numPr>
           <w:ilvl w:val="0"/>
-          <w:numId w:val="19"/>
+          <w:numId w:val="22"/>
         </w:numPr>
         <w:pStyle w:val="ListBullet"/>
+        <w:spacing w:before="0" w:after="28" w:line="240" w:lineRule="auto"/>
       </w:pPr>
       <w:r>
         <w:rPr>
@@ -3853,9 +3879,10 @@
       <w:pPr>
         <w:numPr>
           <w:ilvl w:val="0"/>
-          <w:numId w:val="19"/>
+          <w:numId w:val="22"/>
         </w:numPr>
         <w:pStyle w:val="ListBullet"/>
+        <w:spacing w:before="0" w:after="28" w:line="240" w:lineRule="auto"/>
       </w:pPr>
       <w:r>
         <w:rPr>
@@ -3871,9 +3898,10 @@
       <w:pPr>
         <w:numPr>
           <w:ilvl w:val="0"/>
-          <w:numId w:val="19"/>
+          <w:numId w:val="22"/>
         </w:numPr>
         <w:pStyle w:val="ListBullet"/>
+        <w:spacing w:before="0" w:after="28" w:line="240" w:lineRule="auto"/>
       </w:pPr>
       <w:r>
         <w:rPr>
@@ -3889,9 +3917,10 @@
       <w:pPr>
         <w:numPr>
           <w:ilvl w:val="0"/>
-          <w:numId w:val="19"/>
+          <w:numId w:val="22"/>
         </w:numPr>
         <w:pStyle w:val="ListBullet"/>
+        <w:spacing w:before="0" w:after="28" w:line="240" w:lineRule="auto"/>
       </w:pPr>
       <w:r>
         <w:rPr>
@@ -4029,9 +4058,10 @@
       <w:pPr>
         <w:numPr>
           <w:ilvl w:val="0"/>
-          <w:numId w:val="20"/>
+          <w:numId w:val="23"/>
         </w:numPr>
         <w:pStyle w:val="ListBullet"/>
+        <w:spacing w:before="0" w:after="28" w:line="240" w:lineRule="auto"/>
       </w:pPr>
       <w:r>
         <w:rPr>
@@ -4047,9 +4077,10 @@
       <w:pPr>
         <w:numPr>
           <w:ilvl w:val="0"/>
-          <w:numId w:val="20"/>
+          <w:numId w:val="23"/>
         </w:numPr>
         <w:pStyle w:val="ListBullet"/>
+        <w:spacing w:before="0" w:after="28" w:line="240" w:lineRule="auto"/>
       </w:pPr>
       <w:r>
         <w:rPr>
@@ -4065,9 +4096,10 @@
       <w:pPr>
         <w:numPr>
           <w:ilvl w:val="0"/>
-          <w:numId w:val="20"/>
+          <w:numId w:val="23"/>
         </w:numPr>
         <w:pStyle w:val="ListBullet"/>
+        <w:spacing w:before="0" w:after="28" w:line="240" w:lineRule="auto"/>
       </w:pPr>
       <w:r>
         <w:rPr>
@@ -4083,9 +4115,10 @@
       <w:pPr>
         <w:numPr>
           <w:ilvl w:val="0"/>
-          <w:numId w:val="20"/>
+          <w:numId w:val="23"/>
         </w:numPr>
         <w:pStyle w:val="ListBullet"/>
+        <w:spacing w:before="0" w:after="28" w:line="240" w:lineRule="auto"/>
       </w:pPr>
       <w:r>
         <w:rPr>
@@ -4101,9 +4134,10 @@
       <w:pPr>
         <w:numPr>
           <w:ilvl w:val="0"/>
-          <w:numId w:val="20"/>
+          <w:numId w:val="23"/>
         </w:numPr>
         <w:pStyle w:val="ListBullet"/>
+        <w:spacing w:before="0" w:after="28" w:line="240" w:lineRule="auto"/>
       </w:pPr>
       <w:r>
         <w:rPr>
@@ -4119,9 +4153,10 @@
       <w:pPr>
         <w:numPr>
           <w:ilvl w:val="0"/>
-          <w:numId w:val="20"/>
+          <w:numId w:val="23"/>
         </w:numPr>
         <w:pStyle w:val="ListBullet"/>
+        <w:spacing w:before="0" w:after="28" w:line="240" w:lineRule="auto"/>
       </w:pPr>
       <w:r>
         <w:rPr>
@@ -4881,7 +4916,7 @@
     </w:lvlOverride>
   </w:num>
   <w:num w:numId="17">
-    <w:abstractNumId w:val="10"/>
+    <w:abstractNumId w:val="11"/>
     <w:lvlOverride w:ilvl="0">
       <w:startOverride w:val="1"/>
     </w:lvlOverride>
@@ -4944,6 +4979,69 @@
     </w:lvlOverride>
   </w:num>
   <w:num w:numId="20">
+    <w:abstractNumId w:val="10"/>
+    <w:lvlOverride w:ilvl="0">
+      <w:startOverride w:val="1"/>
+    </w:lvlOverride>
+    <w:lvlOverride w:ilvl="1">
+      <w:startOverride w:val="1"/>
+    </w:lvlOverride>
+    <w:lvlOverride w:ilvl="2">
+      <w:startOverride w:val="1"/>
+    </w:lvlOverride>
+    <w:lvlOverride w:ilvl="3">
+      <w:startOverride w:val="1"/>
+    </w:lvlOverride>
+    <w:lvlOverride w:ilvl="4">
+      <w:startOverride w:val="1"/>
+    </w:lvlOverride>
+    <w:lvlOverride w:ilvl="5">
+      <w:startOverride w:val="1"/>
+    </w:lvlOverride>
+  </w:num>
+  <w:num w:numId="21">
+    <w:abstractNumId w:val="11"/>
+    <w:lvlOverride w:ilvl="0">
+      <w:startOverride w:val="1"/>
+    </w:lvlOverride>
+    <w:lvlOverride w:ilvl="1">
+      <w:startOverride w:val="1"/>
+    </w:lvlOverride>
+    <w:lvlOverride w:ilvl="2">
+      <w:startOverride w:val="1"/>
+    </w:lvlOverride>
+    <w:lvlOverride w:ilvl="3">
+      <w:startOverride w:val="1"/>
+    </w:lvlOverride>
+    <w:lvlOverride w:ilvl="4">
+      <w:startOverride w:val="1"/>
+    </w:lvlOverride>
+    <w:lvlOverride w:ilvl="5">
+      <w:startOverride w:val="1"/>
+    </w:lvlOverride>
+  </w:num>
+  <w:num w:numId="22">
+    <w:abstractNumId w:val="11"/>
+    <w:lvlOverride w:ilvl="0">
+      <w:startOverride w:val="1"/>
+    </w:lvlOverride>
+    <w:lvlOverride w:ilvl="1">
+      <w:startOverride w:val="1"/>
+    </w:lvlOverride>
+    <w:lvlOverride w:ilvl="2">
+      <w:startOverride w:val="1"/>
+    </w:lvlOverride>
+    <w:lvlOverride w:ilvl="3">
+      <w:startOverride w:val="1"/>
+    </w:lvlOverride>
+    <w:lvlOverride w:ilvl="4">
+      <w:startOverride w:val="1"/>
+    </w:lvlOverride>
+    <w:lvlOverride w:ilvl="5">
+      <w:startOverride w:val="1"/>
+    </w:lvlOverride>
+  </w:num>
+  <w:num w:numId="23">
     <w:abstractNumId w:val="11"/>
     <w:lvlOverride w:ilvl="0">
       <w:startOverride w:val="1"/>
@@ -5989,7 +6087,6 @@
     <w:rsid w:val="00FC693F"/>
     <w:pPr>
       <w:spacing w:line="240" w:lineRule="auto" w:before="40" w:after="160"/>
-      <w:jc w:val="center"/>
     </w:pPr>
     <w:rPr>
       <w:b/>
@@ -16954,6 +17051,86 @@
       <w:color w:val="000000"/>
       <w:sz w:val="22"/>
     </w:rPr>
+  </w:style>
+  <w:style w:type="paragraph" w:styleId="ListBullet4">
+    <w:name w:val="List Bullet 4"/>
+    <w:basedOn w:val="ListBullet3"/>
+    <w:pPr>
+      <w:ind w:left="2880" w:hanging="360"/>
+      <w:spacing w:before="0" w:after="40"/>
+    </w:pPr>
+  </w:style>
+  <w:style w:type="paragraph" w:styleId="ListBullet5">
+    <w:name w:val="List Bullet 5"/>
+    <w:basedOn w:val="ListBullet3"/>
+    <w:pPr>
+      <w:ind w:left="3600" w:hanging="360"/>
+      <w:spacing w:before="0" w:after="40"/>
+    </w:pPr>
+  </w:style>
+  <w:style w:type="paragraph" w:styleId="ListBullet6">
+    <w:name w:val="List Bullet 6"/>
+    <w:basedOn w:val="ListBullet3"/>
+    <w:pPr>
+      <w:ind w:left="4320" w:hanging="360"/>
+      <w:spacing w:before="0" w:after="40"/>
+    </w:pPr>
+  </w:style>
+  <w:style w:type="paragraph" w:styleId="ListBullet7">
+    <w:name w:val="List Bullet 7"/>
+    <w:basedOn w:val="ListBullet3"/>
+    <w:pPr>
+      <w:ind w:left="5040" w:hanging="360"/>
+      <w:spacing w:before="0" w:after="40"/>
+    </w:pPr>
+  </w:style>
+  <w:style w:type="paragraph" w:styleId="ListBullet8">
+    <w:name w:val="List Bullet 8"/>
+    <w:basedOn w:val="ListBullet3"/>
+    <w:pPr>
+      <w:ind w:left="5760" w:hanging="360"/>
+      <w:spacing w:before="0" w:after="40"/>
+    </w:pPr>
+  </w:style>
+  <w:style w:type="paragraph" w:styleId="ListNumber4">
+    <w:name w:val="List Number 4"/>
+    <w:basedOn w:val="ListNumber3"/>
+    <w:pPr>
+      <w:ind w:left="2880" w:hanging="360"/>
+      <w:spacing w:before="0" w:after="40"/>
+    </w:pPr>
+  </w:style>
+  <w:style w:type="paragraph" w:styleId="ListNumber5">
+    <w:name w:val="List Number 5"/>
+    <w:basedOn w:val="ListNumber3"/>
+    <w:pPr>
+      <w:ind w:left="3600" w:hanging="360"/>
+      <w:spacing w:before="0" w:after="40"/>
+    </w:pPr>
+  </w:style>
+  <w:style w:type="paragraph" w:styleId="ListNumber6">
+    <w:name w:val="List Number 6"/>
+    <w:basedOn w:val="ListNumber3"/>
+    <w:pPr>
+      <w:ind w:left="4320" w:hanging="360"/>
+      <w:spacing w:before="0" w:after="40"/>
+    </w:pPr>
+  </w:style>
+  <w:style w:type="paragraph" w:styleId="ListNumber7">
+    <w:name w:val="List Number 7"/>
+    <w:basedOn w:val="ListNumber3"/>
+    <w:pPr>
+      <w:ind w:left="5040" w:hanging="360"/>
+      <w:spacing w:before="0" w:after="40"/>
+    </w:pPr>
+  </w:style>
+  <w:style w:type="paragraph" w:styleId="ListNumber8">
+    <w:name w:val="List Number 8"/>
+    <w:basedOn w:val="ListNumber3"/>
+    <w:pPr>
+      <w:ind w:left="5760" w:hanging="360"/>
+      <w:spacing w:before="0" w:after="40"/>
+    </w:pPr>
   </w:style>
   <w:style w:type="table" w:styleId="MdToDocxDataTable">
     <w:name w:val="MdToDocxDataTable"/>

</xml_diff>